<commit_message>
last rendered working version
</commit_message>
<xml_diff>
--- a/docs/Operational-Comparison-of-ANS-Performance.docx
+++ b/docs/Operational-Comparison-of-ANS-Performance.docx
@@ -83,7 +83,7 @@
         <w:pStyle w:val="Date"/>
       </w:pPr>
       <w:r>
-        <w:t xml:space="preserve">2025-04-07</w:t>
+        <w:t xml:space="preserve">2025-04-16</w:t>
       </w:r>
     </w:p>
     <w:sdt>
@@ -504,29 +504,21 @@
       <w:r>
         <w:t xml:space="preserve">This report revises the assessment of both the Brazilian and European air navigation systems, extending the time frame and incorporating additional analyses.</w:t>
       </w:r>
-      <w:r>
-        <w:t xml:space="preserve"> </w:t>
-      </w:r>
-      <w:r>
-        <w:t xml:space="preserve">:::{callout-note}</w:t>
-      </w:r>
-      <w:r>
-        <w:t xml:space="preserve"> </w:t>
-      </w:r>
-      <w:r>
-        <w:t xml:space="preserve">such as point merge system and a short Curitiba and Lisbon ACC comparison</w:t>
-      </w:r>
-      <w:r>
-        <w:t xml:space="preserve"> </w:t>
-      </w:r>
-      <w:r>
-        <w:t xml:space="preserve">:::</w:t>
-      </w:r>
-      <w:r>
-        <w:t xml:space="preserve"> </w:t>
-      </w:r>
-      <w:r>
-        <w:t xml:space="preserve">The report focuses on a subset of the eleven Key Performance Areas identified by the ICAO Global Air Navigation Plan.</w:t>
+    </w:p>
+    <w:p>
+      <w:pPr>
+        <w:pStyle w:val="BodyText"/>
+      </w:pPr>
+      <w:r>
+        <w:t xml:space="preserve">more clever text …such as point merge system and a short Curitiba and Lisbon ACC comparison</w:t>
+      </w:r>
+    </w:p>
+    <w:p>
+      <w:pPr>
+        <w:pStyle w:val="BodyText"/>
+      </w:pPr>
+      <w:r>
+        <w:t xml:space="preserve">The report strongly focuses on a subset of the eleven Key Performance Areas identified by the ICAO Global Air Navigation Plan.</w:t>
       </w:r>
       <w:r>
         <w:t xml:space="preserve"> </w:t>
@@ -2370,7 +2362,7 @@
     </w:p>
     <w:bookmarkEnd w:id="56"/>
     <w:bookmarkEnd w:id="57"/>
-    <w:bookmarkStart w:id="74" w:name="air-navigation-system-characterisation"/>
+    <w:bookmarkStart w:id="76" w:name="air-navigation-system-characterisation"/>
     <w:p>
       <w:pPr>
         <w:pStyle w:val="Heading1"/>
@@ -2384,6 +2376,14 @@
         <w:pStyle w:val="FirstParagraph"/>
       </w:pPr>
       <w:r>
+        <w:t xml:space="preserve">What come here is referring to 2024.</w:t>
+      </w:r>
+    </w:p>
+    <w:p>
+      <w:pPr>
+        <w:pStyle w:val="BodyText"/>
+      </w:pPr>
+      <w:r>
         <w:t xml:space="preserve">This section presents key characteristics of the air navigation systems of Brazil and Europe.</w:t>
       </w:r>
       <w:r>
@@ -2575,7 +2575,7 @@
       </w:r>
     </w:p>
     <w:bookmarkEnd w:id="58"/>
-    <w:bookmarkStart w:id="70" w:name="high-level-system-comparison"/>
+    <w:bookmarkStart w:id="72" w:name="high-level-system-comparison"/>
     <w:p>
       <w:pPr>
         <w:pStyle w:val="Heading2"/>
@@ -2770,9 +2770,11 @@
       <w:r>
         <w:t xml:space="preserve">Yet, Brazil, with lower traffic density related to airspace use, finds probably a more challenging cost-benefit ratio to maintain communication coverage and surveillance for regions with low-traffic.</w:t>
       </w:r>
-      <w:r>
-        <w:t xml:space="preserve"> </w:t>
-      </w:r>
+    </w:p>
+    <w:p>
+      <w:pPr>
+        <w:pStyle w:val="BodyText"/>
+      </w:pPr>
       <w:r>
         <w:t xml:space="preserve">In comparison, the European region faces more considerable challenges in coordinating efforts to adress operational constraints and service the current demand.</w:t>
       </w:r>
@@ -2968,6 +2970,176 @@
         </w:tc>
       </w:tr>
     </w:tbl>
+    <w:tbl>
+      <w:tblPr>
+        <w:tblStyle w:val="Table"/>
+        <w:tblLook w:firstRow="0" w:lastRow="0" w:firstColumn="0" w:lastColumn="0" w:noHBand="0" w:noVBand="0" w:val="0000"/>
+        <w:tblBorders>
+          <w:left w:val="single" w:sz="24" w:space="0" w:color="0758E5"/>
+        </w:tblBorders>
+        <w:tblCellMar>
+          <w:left w:w="0" w:type="dxa"/>
+          <w:right w:w="0" w:type="dxa"/>
+        </w:tblCellMar>
+        <w:tblInd w:w="164" w:type="dxa"/>
+      </w:tblPr>
+      <w:tr>
+        <w:trPr>
+          <w:cantSplit/>
+        </w:trPr>
+        <w:tc>
+          <w:tcPr>
+            <w:tcMar>
+              <w:left w:w="144" w:type="dxa"/>
+              <w:right w:w="144" w:type="dxa"/>
+            </w:tcMar>
+          </w:tcPr>
+          <w:p>
+            <w:pPr>
+              <w:pStyle w:val="BodyText"/>
+            </w:pPr>
+            <w:pPr>
+              <w:spacing w:before="0" w:after="8"/>
+              <w:jc w:val="center"/>
+            </w:pPr>
+            <w:r>
+              <w:drawing>
+                <wp:inline>
+                  <wp:extent cx="152400" cy="152400"/>
+                  <wp:effectExtent b="0" l="0" r="0" t="0"/>
+                  <wp:docPr descr="" title="" id="70" name="Picture"/>
+                  <a:graphic>
+                    <a:graphicData uri="http://schemas.openxmlformats.org/drawingml/2006/picture">
+                      <pic:pic>
+                        <pic:nvPicPr>
+                          <pic:cNvPr descr="/Applications/quarto/share/formats/docx/note.png" id="71" name="Picture"/>
+                          <pic:cNvPicPr>
+                            <a:picLocks noChangeArrowheads="1" noChangeAspect="1"/>
+                          </pic:cNvPicPr>
+                        </pic:nvPicPr>
+                        <pic:blipFill>
+                          <a:blip r:embed="rId63"/>
+                          <a:stretch>
+                            <a:fillRect/>
+                          </a:stretch>
+                        </pic:blipFill>
+                        <pic:spPr bwMode="auto">
+                          <a:xfrm>
+                            <a:off x="0" y="0"/>
+                            <a:ext cx="152400" cy="152400"/>
+                          </a:xfrm>
+                          <a:prstGeom prst="rect">
+                            <a:avLst/>
+                          </a:prstGeom>
+                          <a:noFill/>
+                          <a:ln w="9525">
+                            <a:noFill/>
+                            <a:headEnd/>
+                            <a:tailEnd/>
+                          </a:ln>
+                        </pic:spPr>
+                      </pic:pic>
+                    </a:graphicData>
+                  </a:graphic>
+                </wp:inline>
+              </w:drawing>
+            </w:r>
+          </w:p>
+        </w:tc>
+        <w:tc>
+          <w:p>
+            <w:pPr>
+              <w:pStyle w:val="BodyText"/>
+            </w:pPr>
+            <w:pPr>
+              <w:spacing w:before="16" w:after="64"/>
+            </w:pPr>
+          </w:p>
+          <w:p>
+            <w:pPr>
+              <w:pStyle w:val="BodyText"/>
+            </w:pPr>
+            <w:pPr>
+              <w:spacing w:before="16"/>
+            </w:pPr>
+            <w:r>
+              <w:t xml:space="preserve">The distribution of air traffic in Brazil confirms that most flights are concentrated in a small number of airports.</w:t>
+            </w:r>
+            <w:r>
+              <w:t xml:space="preserve"> </w:t>
+            </w:r>
+            <w:r>
+              <w:t xml:space="preserve">In 2024, the 10 busiest airports handled 66.23% of all flights.</w:t>
+            </w:r>
+            <w:r>
+              <w:t xml:space="preserve"> </w:t>
+            </w:r>
+            <w:r>
+              <w:t xml:space="preserve">The top 18 airports accounted for 80% of operations, while 90% of all flights took place at just 32 airports.</w:t>
+            </w:r>
+            <w:r>
+              <w:t xml:space="preserve"> </w:t>
+            </w:r>
+            <w:r>
+              <w:t xml:space="preserve">If we consider the 49 busiest airports, they covered 95% of traffic, and 99% of all flights occurred at the top 100 airports in the country.</w:t>
+            </w:r>
+            <w:r>
+              <w:t xml:space="preserve"> </w:t>
+            </w:r>
+            <w:r>
+              <w:t xml:space="preserve">The latest edition of Brazil’s Annual Performance Report (it can be found on http://performance.decea.mil.br reflects this reality. It now includes 100 airport locations instead of only the top 34, ensuring that almost all flights are included in the analysis. This distribution shows that many aerodromes operate with low traffic volumes. Because of that, it is important to study alternative ways to provide air traffic services.</w:t>
+            </w:r>
+          </w:p>
+          <w:p>
+            <w:pPr>
+              <w:pStyle w:val="BodyText"/>
+            </w:pPr>
+            <w:pPr>
+              <w:spacing w:after="16"/>
+            </w:pPr>
+            <w:r>
+              <w:t xml:space="preserve">In Brazil, the Aerodrome Flight Information Service (AFIS) has been an effective strategy to ensure safety at locations where the traffic does not justify the installation of a control tower (TWR).</w:t>
+            </w:r>
+            <w:r>
+              <w:t xml:space="preserve"> </w:t>
+            </w:r>
+            <w:r>
+              <w:t xml:space="preserve">This service, usually provided via Radio, gives essential information to pilots, helping to use resources efficiently and keeping safe operations.</w:t>
+            </w:r>
+            <w:r>
+              <w:t xml:space="preserve"> </w:t>
+            </w:r>
+            <w:r>
+              <w:t xml:space="preserve">Since 2016, Brazil has been expanding the use of remote AFIS units (R-AFIS), especially in strategic areas like the Amazon region.</w:t>
+            </w:r>
+            <w:r>
+              <w:t xml:space="preserve"> </w:t>
+            </w:r>
+            <w:r>
+              <w:t xml:space="preserve">These services are provided from ACCs (Area Control Centers), which means they don’t need dedicated local infrastructure.</w:t>
+            </w:r>
+            <w:r>
+              <w:t xml:space="preserve"> </w:t>
+            </w:r>
+            <w:r>
+              <w:t xml:space="preserve">Also, in 2024, demand for air traffic services continued to grow.</w:t>
+            </w:r>
+            <w:r>
+              <w:t xml:space="preserve"> </w:t>
+            </w:r>
+            <w:r>
+              <w:t xml:space="preserve">This shows the need to review and improve how services are organized in Brazil.</w:t>
+            </w:r>
+            <w:r>
+              <w:t xml:space="preserve"> </w:t>
+            </w:r>
+            <w:r>
+              <w:t xml:space="preserve">Expanding the use of the AFIS model in strategic areas may be a smart and safe way to meet future needs and make better use of SISCEAB’s resources.</w:t>
+            </w:r>
+          </w:p>
+        </w:tc>
+      </w:tr>
+    </w:tbl>
     <w:p>
       <w:pPr>
         <w:pStyle w:val="BodyText"/>
@@ -3135,8 +3307,8 @@
         <w:t xml:space="preserve">Further research can explore how both regions can maximise installed capacity, benefit from novel operational or technical concepts, and suggest improvements for ANS provision.</w:t>
       </w:r>
     </w:p>
-    <w:bookmarkEnd w:id="70"/>
-    <w:bookmarkStart w:id="72" w:name="X84954e512131c13ae1f1d878d06e1bb85be2050"/>
+    <w:bookmarkEnd w:id="72"/>
+    <w:bookmarkStart w:id="74" w:name="X84954e512131c13ae1f1d878d06e1bb85be2050"/>
     <w:p>
       <w:pPr>
         <w:pStyle w:val="Heading2"/>
@@ -3277,7 +3449,7 @@
       <w:r>
         <w:t xml:space="preserve"> </w:t>
       </w:r>
-      <w:hyperlink r:id="rId71">
+      <w:hyperlink r:id="rId73">
         <w:r>
           <w:rPr>
             <w:rStyle w:val="Hyperlink"/>
@@ -3306,8 +3478,8 @@
         <w:t xml:space="preserve">.</w:t>
       </w:r>
     </w:p>
-    <w:bookmarkEnd w:id="72"/>
-    <w:bookmarkStart w:id="73" w:name="summary"/>
+    <w:bookmarkEnd w:id="74"/>
+    <w:bookmarkStart w:id="75" w:name="summary"/>
     <w:p>
       <w:pPr>
         <w:pStyle w:val="Heading2"/>
@@ -3414,9 +3586,9 @@
         <w:t xml:space="preserve">The effort benefits the two regions and contributes globally by sharing insights and lessons learned with international aviation communities, aiding the development of ATM performance management worldwide.</w:t>
       </w:r>
     </w:p>
-    <w:bookmarkEnd w:id="73"/>
-    <w:bookmarkEnd w:id="74"/>
-    <w:bookmarkStart w:id="112" w:name="traffic-characterisation"/>
+    <w:bookmarkEnd w:id="75"/>
+    <w:bookmarkEnd w:id="76"/>
+    <w:bookmarkStart w:id="121" w:name="traffic-characterisation"/>
     <w:p>
       <w:pPr>
         <w:pStyle w:val="Heading1"/>
@@ -3445,7 +3617,7 @@
         <w:t xml:space="preserve">This chapter presents some air traffic characteristics for both regions to provide a framework for the observed operational performance in subsequent parts of the report.</w:t>
       </w:r>
     </w:p>
-    <w:bookmarkStart w:id="83" w:name="network-level-air-traffic"/>
+    <w:bookmarkStart w:id="85" w:name="network-level-air-traffic"/>
     <w:p>
       <w:pPr>
         <w:pStyle w:val="Heading2"/>
@@ -3523,7 +3695,7 @@
       <w:tr>
         <w:tc>
           <w:tcPr/>
-          <w:bookmarkStart w:id="78" w:name="fig-annual-traffic-timeline"/>
+          <w:bookmarkStart w:id="80" w:name="fig-annual-traffic-timeline"/>
           <w:p>
             <w:pPr>
               <w:pStyle w:val="Compact"/>
@@ -3534,18 +3706,18 @@
                 <wp:inline>
                   <wp:extent cx="5334000" cy="4267200"/>
                   <wp:effectExtent b="0" l="0" r="0" t="0"/>
-                  <wp:docPr descr="" title="" id="76" name="Picture"/>
+                  <wp:docPr descr="" title="" id="78" name="Picture"/>
                   <a:graphic>
                     <a:graphicData uri="http://schemas.openxmlformats.org/drawingml/2006/picture">
                       <pic:pic>
                         <pic:nvPicPr>
-                          <pic:cNvPr descr="03-traffic_characterisation_files/figure-docx/fig-annual-traffic-timeline-1.png" id="77" name="Picture"/>
+                          <pic:cNvPr descr="03-traffic_characterisation_files/figure-docx/fig-annual-traffic-timeline-1.png" id="79" name="Picture"/>
                           <pic:cNvPicPr>
                             <a:picLocks noChangeArrowheads="1" noChangeAspect="1"/>
                           </pic:cNvPicPr>
                         </pic:nvPicPr>
                         <pic:blipFill>
-                          <a:blip r:embed="rId75"/>
+                          <a:blip r:embed="rId77"/>
                           <a:stretch>
                             <a:fillRect/>
                           </a:stretch>
@@ -3585,7 +3757,7 @@
               <w:t xml:space="preserve">Figure 3.1: Regional daily air traffic</w:t>
             </w:r>
           </w:p>
-          <w:bookmarkEnd w:id="78"/>
+          <w:bookmarkEnd w:id="80"/>
         </w:tc>
       </w:tr>
     </w:tbl>
@@ -3722,7 +3894,7 @@
       <w:tr>
         <w:tc>
           <w:tcPr/>
-          <w:bookmarkStart w:id="82" w:name="fig-annual-network"/>
+          <w:bookmarkStart w:id="84" w:name="fig-annual-network"/>
           <w:p>
             <w:pPr>
               <w:pStyle w:val="Compact"/>
@@ -3733,18 +3905,18 @@
                 <wp:inline>
                   <wp:extent cx="5334000" cy="4267200"/>
                   <wp:effectExtent b="0" l="0" r="0" t="0"/>
-                  <wp:docPr descr="" title="" id="80" name="Picture"/>
+                  <wp:docPr descr="" title="" id="82" name="Picture"/>
                   <a:graphic>
                     <a:graphicData uri="http://schemas.openxmlformats.org/drawingml/2006/picture">
                       <pic:pic>
                         <pic:nvPicPr>
-                          <pic:cNvPr descr="03-traffic_characterisation_files/figure-docx/fig-annual-network-1.png" id="81" name="Picture"/>
+                          <pic:cNvPr descr="03-traffic_characterisation_files/figure-docx/fig-annual-network-1.png" id="83" name="Picture"/>
                           <pic:cNvPicPr>
                             <a:picLocks noChangeArrowheads="1" noChangeAspect="1"/>
                           </pic:cNvPicPr>
                         </pic:nvPicPr>
                         <pic:blipFill>
-                          <a:blip r:embed="rId79"/>
+                          <a:blip r:embed="rId81"/>
                           <a:stretch>
                             <a:fillRect/>
                           </a:stretch>
@@ -3784,7 +3956,7 @@
               <w:t xml:space="preserve">Figure 3.2: Evolution of annual network traffic</w:t>
             </w:r>
           </w:p>
-          <w:bookmarkEnd w:id="82"/>
+          <w:bookmarkEnd w:id="84"/>
         </w:tc>
       </w:tr>
     </w:tbl>
@@ -3854,8 +4026,8 @@
         <w:t xml:space="preserve">It will be interesting to observe the further evolution and growth of air traffic.</w:t>
       </w:r>
     </w:p>
-    <w:bookmarkEnd w:id="83"/>
-    <w:bookmarkStart w:id="98" w:name="airport-level-air-traffic"/>
+    <w:bookmarkEnd w:id="85"/>
+    <w:bookmarkStart w:id="100" w:name="airport-level-air-traffic"/>
     <w:p>
       <w:pPr>
         <w:pStyle w:val="Heading2"/>
@@ -3899,18 +4071,18 @@
           <wp:inline>
             <wp:extent cx="5334000" cy="4267200"/>
             <wp:effectExtent b="0" l="0" r="0" t="0"/>
-            <wp:docPr descr="" title="" id="85" name="Picture"/>
+            <wp:docPr descr="" title="" id="87" name="Picture"/>
             <a:graphic>
               <a:graphicData uri="http://schemas.openxmlformats.org/drawingml/2006/picture">
                 <pic:pic>
                   <pic:nvPicPr>
-                    <pic:cNvPr descr="03-traffic_characterisation_files/figure-docx/unnamed-chunk-4-1.png" id="86" name="Picture"/>
+                    <pic:cNvPr descr="03-traffic_characterisation_files/figure-docx/unnamed-chunk-4-1.png" id="88" name="Picture"/>
                     <pic:cNvPicPr>
                       <a:picLocks noChangeArrowheads="1" noChangeAspect="1"/>
                     </pic:cNvPicPr>
                   </pic:nvPicPr>
                   <pic:blipFill>
-                    <a:blip r:embed="rId84"/>
+                    <a:blip r:embed="rId86"/>
                     <a:stretch>
                       <a:fillRect/>
                     </a:stretch>
@@ -3951,7 +4123,7 @@
       <w:tr>
         <w:tc>
           <w:tcPr/>
-          <w:bookmarkStart w:id="90" w:name="fig-eur-apt-level-tfc"/>
+          <w:bookmarkStart w:id="92" w:name="fig-eur-apt-level-tfc"/>
           <w:p>
             <w:pPr>
               <w:pStyle w:val="Compact"/>
@@ -3962,18 +4134,18 @@
                 <wp:inline>
                   <wp:extent cx="5334000" cy="4267200"/>
                   <wp:effectExtent b="0" l="0" r="0" t="0"/>
-                  <wp:docPr descr="" title="" id="88" name="Picture"/>
+                  <wp:docPr descr="" title="" id="90" name="Picture"/>
                   <a:graphic>
                     <a:graphicData uri="http://schemas.openxmlformats.org/drawingml/2006/picture">
                       <pic:pic>
                         <pic:nvPicPr>
-                          <pic:cNvPr descr="03-traffic_characterisation_files/figure-docx/fig-eur-apt-level-tfc-1.png" id="89" name="Picture"/>
+                          <pic:cNvPr descr="03-traffic_characterisation_files/figure-docx/fig-eur-apt-level-tfc-1.png" id="91" name="Picture"/>
                           <pic:cNvPicPr>
                             <a:picLocks noChangeArrowheads="1" noChangeAspect="1"/>
                           </pic:cNvPicPr>
                         </pic:nvPicPr>
                         <pic:blipFill>
-                          <a:blip r:embed="rId87"/>
+                          <a:blip r:embed="rId89"/>
                           <a:stretch>
                             <a:fillRect/>
                           </a:stretch>
@@ -4013,7 +4185,7 @@
               <w:t xml:space="preserve">Figure 3.3: Europeaan airport level traffic</w:t>
             </w:r>
           </w:p>
-          <w:bookmarkEnd w:id="90"/>
+          <w:bookmarkEnd w:id="92"/>
         </w:tc>
       </w:tr>
     </w:tbl>
@@ -4026,18 +4198,18 @@
           <wp:inline>
             <wp:extent cx="5334000" cy="4267200"/>
             <wp:effectExtent b="0" l="0" r="0" t="0"/>
-            <wp:docPr descr="" title="" id="92" name="Picture"/>
+            <wp:docPr descr="" title="" id="94" name="Picture"/>
             <a:graphic>
               <a:graphicData uri="http://schemas.openxmlformats.org/drawingml/2006/picture">
                 <pic:pic>
                   <pic:nvPicPr>
-                    <pic:cNvPr descr="03-traffic_characterisation_files/figure-docx/unnamed-chunk-6-1.png" id="93" name="Picture"/>
+                    <pic:cNvPr descr="03-traffic_characterisation_files/figure-docx/unnamed-chunk-6-1.png" id="95" name="Picture"/>
                     <pic:cNvPicPr>
                       <a:picLocks noChangeArrowheads="1" noChangeAspect="1"/>
                     </pic:cNvPicPr>
                   </pic:nvPicPr>
                   <pic:blipFill>
-                    <a:blip r:embed="rId91"/>
+                    <a:blip r:embed="rId93"/>
                     <a:stretch>
                       <a:fillRect/>
                     </a:stretch>
@@ -4098,7 +4270,7 @@
       <w:tr>
         <w:tc>
           <w:tcPr/>
-          <w:bookmarkStart w:id="97" w:name="fig-apt-annual-change"/>
+          <w:bookmarkStart w:id="99" w:name="fig-apt-annual-change"/>
           <w:p>
             <w:pPr>
               <w:pStyle w:val="Compact"/>
@@ -4109,18 +4281,18 @@
                 <wp:inline>
                   <wp:extent cx="5334000" cy="4267200"/>
                   <wp:effectExtent b="0" l="0" r="0" t="0"/>
-                  <wp:docPr descr="" title="" id="95" name="Picture"/>
+                  <wp:docPr descr="" title="" id="97" name="Picture"/>
                   <a:graphic>
                     <a:graphicData uri="http://schemas.openxmlformats.org/drawingml/2006/picture">
                       <pic:pic>
                         <pic:nvPicPr>
-                          <pic:cNvPr descr="03-traffic_characterisation_files/figure-docx/fig-apt-annual-change-1.png" id="96" name="Picture"/>
+                          <pic:cNvPr descr="03-traffic_characterisation_files/figure-docx/fig-apt-annual-change-1.png" id="98" name="Picture"/>
                           <pic:cNvPicPr>
                             <a:picLocks noChangeArrowheads="1" noChangeAspect="1"/>
                           </pic:cNvPicPr>
                         </pic:nvPicPr>
                         <pic:blipFill>
-                          <a:blip r:embed="rId94"/>
+                          <a:blip r:embed="rId96"/>
                           <a:stretch>
                             <a:fillRect/>
                           </a:stretch>
@@ -4160,7 +4332,7 @@
               <w:t xml:space="preserve">Figure 3.4: Annual traffic at study airports in 2022 and variation 2022/2019</w:t>
             </w:r>
           </w:p>
-          <w:bookmarkEnd w:id="97"/>
+          <w:bookmarkEnd w:id="99"/>
         </w:tc>
       </w:tr>
     </w:tbl>
@@ -4241,8 +4413,8 @@
         <w:t xml:space="preserve">The increased network level traffic (ranging about 10% under the pre-pandemic level) is distributed across the European network and other aerodrome connections.</w:t>
       </w:r>
     </w:p>
-    <w:bookmarkEnd w:id="98"/>
-    <w:bookmarkStart w:id="99" w:name="peak-day-traffic"/>
+    <w:bookmarkEnd w:id="100"/>
+    <w:bookmarkStart w:id="101" w:name="peak-day-traffic"/>
     <w:p>
       <w:pPr>
         <w:pStyle w:val="Heading2"/>
@@ -4277,8 +4449,8 @@
         <w:t xml:space="preserve">The measure represents thus an upper bound for comparison purposes.</w:t>
       </w:r>
     </w:p>
-    <w:bookmarkEnd w:id="99"/>
-    <w:bookmarkStart w:id="100" w:name="peak-day"/>
+    <w:bookmarkEnd w:id="101"/>
+    <w:bookmarkStart w:id="109" w:name="peak-day"/>
     <w:p>
       <w:pPr>
         <w:pStyle w:val="Heading2"/>
@@ -4379,197 +4551,49 @@
     </w:p>
     <w:p>
       <w:pPr>
-        <w:pStyle w:val="SourceCode"/>
-      </w:pPr>
-      <w:r>
-        <w:rPr>
-          <w:rStyle w:val="VerbatimChar"/>
-        </w:rPr>
-        <w:t xml:space="preserve">.years &lt;- c(2023,2024)</w:t>
-      </w:r>
-      <w:r>
-        <w:br/>
-      </w:r>
-      <w:r>
-        <w:rPr>
-          <w:rStyle w:val="VerbatimChar"/>
-        </w:rPr>
-        <w:t xml:space="preserve">pk_day_plot(.years)</w:t>
-      </w:r>
-    </w:p>
-    <w:p>
-      <w:pPr>
-        <w:pStyle w:val="SourceCode"/>
-      </w:pPr>
-      <w:r>
-        <w:rPr>
-          <w:rStyle w:val="VerbatimChar"/>
-        </w:rPr>
-        <w:t xml:space="preserve">#| label: fig-peak-day</w:t>
-      </w:r>
-      <w:r>
-        <w:br/>
-      </w:r>
-      <w:r>
-        <w:rPr>
-          <w:rStyle w:val="VerbatimChar"/>
-        </w:rPr>
-        <w:t xml:space="preserve">#| fig-cap: Airport peak daily traffic (2024)</w:t>
-      </w:r>
-      <w:r>
-        <w:br/>
-      </w:r>
-      <w:r>
-        <w:rPr>
-          <w:rStyle w:val="VerbatimChar"/>
-        </w:rPr>
-        <w:t xml:space="preserve">#| message: false</w:t>
-      </w:r>
-      <w:r>
-        <w:br/>
-      </w:r>
-      <w:r>
-        <w:br/>
-      </w:r>
-      <w:r>
-        <w:rPr>
-          <w:rStyle w:val="VerbatimChar"/>
-        </w:rPr>
-        <w:t xml:space="preserve">peak_day_pct_plot(2024)</w:t>
-      </w:r>
-    </w:p>
-    <w:p>
-      <w:pPr>
-        <w:pStyle w:val="FirstParagraph"/>
-      </w:pPr>
-      <w:r>
-        <w:rPr>
-          <w:bCs/>
-          <w:b/>
-        </w:rPr>
-        <w:t xml:space="preserve">?@fig-peak-day</w:t>
-      </w:r>
-      <w:r>
-        <w:t xml:space="preserve"> </w:t>
-      </w:r>
-      <w:r>
-        <w:t xml:space="preserve">shows the peak day traffic in 2022 for the study airports with reference to the number of runways.</w:t>
-      </w:r>
-      <w:r>
-        <w:t xml:space="preserve"> </w:t>
-      </w:r>
-      <w:r>
-        <w:t xml:space="preserve">A varied picture can be seen for Europe.</w:t>
-      </w:r>
-      <w:r>
-        <w:t xml:space="preserve"> </w:t>
-      </w:r>
-      <w:r>
-        <w:t xml:space="preserve">For European with more than 2 runways it needs to be noted that the runway system does not support independent operations of all available runways.</w:t>
-      </w:r>
-      <w:r>
-        <w:t xml:space="preserve"> </w:t>
-      </w:r>
-      <w:r>
-        <w:t xml:space="preserve">Thus, the serviced peak traffic is also impacted by the runway system configuration.</w:t>
-      </w:r>
-    </w:p>
-    <w:p>
-      <w:pPr>
         <w:pStyle w:val="BodyText"/>
       </w:pPr>
       <w:r>
-        <w:t xml:space="preserve">The measure signals the use of the available runway system.</w:t>
-      </w:r>
-    </w:p>
-    <w:p>
-      <w:pPr>
-        <w:pStyle w:val="SourceCode"/>
-      </w:pPr>
-      <w:r>
-        <w:rPr>
-          <w:rStyle w:val="VerbatimChar"/>
-        </w:rPr>
-        <w:t xml:space="preserve">#| label: fig-timeline-peak-day</w:t>
-      </w:r>
-      <w:r>
-        <w:br/>
-      </w:r>
-      <w:r>
-        <w:rPr>
-          <w:rStyle w:val="VerbatimChar"/>
-        </w:rPr>
-        <w:t xml:space="preserve">#| fig-cap: Evolution of peak-day traffic at study airports</w:t>
-      </w:r>
-      <w:r>
-        <w:br/>
-      </w:r>
-      <w:r>
-        <w:rPr>
-          <w:rStyle w:val="VerbatimChar"/>
-        </w:rPr>
-        <w:t xml:space="preserve">#| message: false</w:t>
-      </w:r>
-      <w:r>
-        <w:br/>
-      </w:r>
-      <w:r>
-        <w:br/>
-      </w:r>
-      <w:r>
-        <w:rPr>
-          <w:rStyle w:val="VerbatimChar"/>
-        </w:rPr>
-        <w:t xml:space="preserve">timeline_peak_day(c(2019:2024))</w:t>
-      </w:r>
-    </w:p>
-    <w:p>
-      <w:pPr>
-        <w:pStyle w:val="FirstParagraph"/>
-      </w:pPr>
-      <w:r>
-        <w:t xml:space="preserve">The year-to-year change of the peak day traffic between 2019 and 2022 is shown in</w:t>
-      </w:r>
-      <w:r>
-        <w:t xml:space="preserve"> </w:t>
-      </w:r>
-      <w:r>
-        <w:rPr>
-          <w:bCs/>
-          <w:b/>
-        </w:rPr>
-        <w:t xml:space="preserve">?@fig-timeline-peak-day</w:t>
-      </w:r>
-      <w:r>
-        <w:t xml:space="preserve">.</w:t>
-      </w:r>
-      <w:r>
-        <w:t xml:space="preserve"> </w:t>
-      </w:r>
-      <w:r>
-        <w:t xml:space="preserve">For the European study airports, Frankfurt (EDDF), Munich (EDDM), Paris (LFPG), and Rome (LIRF) experienced a higher drop of the daily peak traffic in comparison to 2019.</w:t>
-      </w:r>
-      <w:r>
-        <w:t xml:space="preserve"> </w:t>
-      </w:r>
-      <w:r>
-        <w:t xml:space="preserve">Despite the not yet fully recovered demand situation at London Gatwick (EGKK) and Zurich (LSZH) showed a moderate reduction of the daily peak traffic in 2022.</w:t>
-      </w:r>
-      <w:r>
-        <w:t xml:space="preserve"> </w:t>
-      </w:r>
-      <w:r>
-        <w:t xml:space="preserve">This suggest that airports with limited airport runway capacity managed</w:t>
-      </w:r>
-    </w:p>
-    <w:bookmarkEnd w:id="100"/>
-    <w:bookmarkStart w:id="110" w:name="fleet-mix"/>
-    <w:p>
-      <w:pPr>
-        <w:pStyle w:val="Heading2"/>
-      </w:pPr>
-      <w:r>
-        <w:t xml:space="preserve">3.5 Fleet Mix</w:t>
+        <w:drawing>
+          <wp:inline>
+            <wp:extent cx="5334000" cy="4267200"/>
+            <wp:effectExtent b="0" l="0" r="0" t="0"/>
+            <wp:docPr descr="" title="" id="103" name="Picture"/>
+            <a:graphic>
+              <a:graphicData uri="http://schemas.openxmlformats.org/drawingml/2006/picture">
+                <pic:pic>
+                  <pic:nvPicPr>
+                    <pic:cNvPr descr="03-traffic_characterisation_files/figure-docx/unnamed-chunk-8-1.png" id="104" name="Picture"/>
+                    <pic:cNvPicPr>
+                      <a:picLocks noChangeArrowheads="1" noChangeAspect="1"/>
+                    </pic:cNvPicPr>
+                  </pic:nvPicPr>
+                  <pic:blipFill>
+                    <a:blip r:embed="rId102"/>
+                    <a:stretch>
+                      <a:fillRect/>
+                    </a:stretch>
+                  </pic:blipFill>
+                  <pic:spPr bwMode="auto">
+                    <a:xfrm>
+                      <a:off x="0" y="0"/>
+                      <a:ext cx="5334000" cy="4267200"/>
+                    </a:xfrm>
+                    <a:prstGeom prst="rect">
+                      <a:avLst/>
+                    </a:prstGeom>
+                    <a:noFill/>
+                    <a:ln w="9525">
+                      <a:noFill/>
+                      <a:headEnd/>
+                      <a:tailEnd/>
+                    </a:ln>
+                  </pic:spPr>
+                </pic:pic>
+              </a:graphicData>
+            </a:graphic>
+          </wp:inline>
+        </w:drawing>
       </w:r>
     </w:p>
     <w:tbl>
@@ -4586,7 +4610,222 @@
       <w:tr>
         <w:tc>
           <w:tcPr/>
-          <w:bookmarkStart w:id="104" w:name="fig-fleet-mix"/>
+          <w:bookmarkStart w:id="108" w:name="fig-peak-day"/>
+          <w:p>
+            <w:pPr>
+              <w:pStyle w:val="Compact"/>
+              <w:jc w:val="center"/>
+            </w:pPr>
+            <w:r>
+              <w:drawing>
+                <wp:inline>
+                  <wp:extent cx="5334000" cy="4267200"/>
+                  <wp:effectExtent b="0" l="0" r="0" t="0"/>
+                  <wp:docPr descr="" title="" id="106" name="Picture"/>
+                  <a:graphic>
+                    <a:graphicData uri="http://schemas.openxmlformats.org/drawingml/2006/picture">
+                      <pic:pic>
+                        <pic:nvPicPr>
+                          <pic:cNvPr descr="03-traffic_characterisation_files/figure-docx/fig-peak-day-1.png" id="107" name="Picture"/>
+                          <pic:cNvPicPr>
+                            <a:picLocks noChangeArrowheads="1" noChangeAspect="1"/>
+                          </pic:cNvPicPr>
+                        </pic:nvPicPr>
+                        <pic:blipFill>
+                          <a:blip r:embed="rId105"/>
+                          <a:stretch>
+                            <a:fillRect/>
+                          </a:stretch>
+                        </pic:blipFill>
+                        <pic:spPr bwMode="auto">
+                          <a:xfrm>
+                            <a:off x="0" y="0"/>
+                            <a:ext cx="5334000" cy="4267200"/>
+                          </a:xfrm>
+                          <a:prstGeom prst="rect">
+                            <a:avLst/>
+                          </a:prstGeom>
+                          <a:noFill/>
+                          <a:ln w="9525">
+                            <a:noFill/>
+                            <a:headEnd/>
+                            <a:tailEnd/>
+                          </a:ln>
+                        </pic:spPr>
+                      </pic:pic>
+                    </a:graphicData>
+                  </a:graphic>
+                </wp:inline>
+              </w:drawing>
+            </w:r>
+          </w:p>
+          <w:p>
+            <w:pPr>
+              <w:jc w:val="center"/>
+            </w:pPr>
+            <w:pPr>
+              <w:jc w:val="start"/>
+              <w:spacing w:before="200"/>
+              <w:pStyle w:val="ImageCaption"/>
+            </w:pPr>
+            <w:r>
+              <w:t xml:space="preserve">Figure 3.5: Airport peak daily traffic (2024)</w:t>
+            </w:r>
+          </w:p>
+          <w:bookmarkEnd w:id="108"/>
+        </w:tc>
+      </w:tr>
+    </w:tbl>
+    <w:p>
+      <w:pPr>
+        <w:pStyle w:val="BodyText"/>
+      </w:pPr>
+      <w:hyperlink w:anchor="fig-peak-day">
+        <w:r>
+          <w:rPr>
+            <w:rStyle w:val="Hyperlink"/>
+          </w:rPr>
+          <w:t xml:space="preserve">Figure 3.5</w:t>
+        </w:r>
+      </w:hyperlink>
+      <w:r>
+        <w:t xml:space="preserve"> </w:t>
+      </w:r>
+      <w:r>
+        <w:t xml:space="preserve">shows the peak day traffic in 2022 for the study airports with reference to the number of runways.</w:t>
+      </w:r>
+      <w:r>
+        <w:t xml:space="preserve"> </w:t>
+      </w:r>
+      <w:r>
+        <w:t xml:space="preserve">A varied picture can be seen for Europe.</w:t>
+      </w:r>
+      <w:r>
+        <w:t xml:space="preserve"> </w:t>
+      </w:r>
+      <w:r>
+        <w:t xml:space="preserve">For European with more than 2 runways it needs to be noted that the runway system does not support independent operations of all available runways.</w:t>
+      </w:r>
+      <w:r>
+        <w:t xml:space="preserve"> </w:t>
+      </w:r>
+      <w:r>
+        <w:t xml:space="preserve">Thus, the serviced peak traffic is also impacted by the runway system configuration.</w:t>
+      </w:r>
+    </w:p>
+    <w:p>
+      <w:pPr>
+        <w:pStyle w:val="BodyText"/>
+      </w:pPr>
+      <w:r>
+        <w:t xml:space="preserve">The measure signals the use of the available runway system.</w:t>
+      </w:r>
+    </w:p>
+    <w:p>
+      <w:pPr>
+        <w:pStyle w:val="SourceCode"/>
+      </w:pPr>
+      <w:r>
+        <w:rPr>
+          <w:rStyle w:val="VerbatimChar"/>
+        </w:rPr>
+        <w:t xml:space="preserve">#| label: fig-timeline-peak-day</w:t>
+      </w:r>
+      <w:r>
+        <w:br/>
+      </w:r>
+      <w:r>
+        <w:rPr>
+          <w:rStyle w:val="VerbatimChar"/>
+        </w:rPr>
+        <w:t xml:space="preserve">#| fig-cap: Evolution of peak-day traffic at study airports</w:t>
+      </w:r>
+      <w:r>
+        <w:br/>
+      </w:r>
+      <w:r>
+        <w:rPr>
+          <w:rStyle w:val="VerbatimChar"/>
+        </w:rPr>
+        <w:t xml:space="preserve">#| message: false</w:t>
+      </w:r>
+      <w:r>
+        <w:br/>
+      </w:r>
+      <w:r>
+        <w:br/>
+      </w:r>
+      <w:r>
+        <w:rPr>
+          <w:rStyle w:val="VerbatimChar"/>
+        </w:rPr>
+        <w:t xml:space="preserve">timeline_peak_day(c(2019:2024))</w:t>
+      </w:r>
+    </w:p>
+    <w:p>
+      <w:pPr>
+        <w:pStyle w:val="FirstParagraph"/>
+      </w:pPr>
+      <w:r>
+        <w:t xml:space="preserve">The year-to-year change of the peak day traffic between 2019 and 2022 is shown in</w:t>
+      </w:r>
+      <w:r>
+        <w:t xml:space="preserve"> </w:t>
+      </w:r>
+      <w:r>
+        <w:rPr>
+          <w:bCs/>
+          <w:b/>
+        </w:rPr>
+        <w:t xml:space="preserve">?@fig-timeline-peak-day</w:t>
+      </w:r>
+      <w:r>
+        <w:t xml:space="preserve">.</w:t>
+      </w:r>
+      <w:r>
+        <w:t xml:space="preserve"> </w:t>
+      </w:r>
+      <w:r>
+        <w:t xml:space="preserve">For the European study airports, Frankfurt (EDDF), Munich (EDDM), Paris (LFPG), and Rome (LIRF) experienced a higher drop of the daily peak traffic in comparison to 2019.</w:t>
+      </w:r>
+      <w:r>
+        <w:t xml:space="preserve"> </w:t>
+      </w:r>
+      <w:r>
+        <w:t xml:space="preserve">Despite the not yet fully recovered demand situation at London Gatwick (EGKK) and Zurich (LSZH) showed a moderate reduction of the daily peak traffic in 2022.</w:t>
+      </w:r>
+      <w:r>
+        <w:t xml:space="preserve"> </w:t>
+      </w:r>
+      <w:r>
+        <w:t xml:space="preserve">This suggest that airports with limited airport runway capacity managed</w:t>
+      </w:r>
+    </w:p>
+    <w:bookmarkEnd w:id="109"/>
+    <w:bookmarkStart w:id="119" w:name="fleet-mix"/>
+    <w:p>
+      <w:pPr>
+        <w:pStyle w:val="Heading2"/>
+      </w:pPr>
+      <w:r>
+        <w:t xml:space="preserve">3.5 Fleet Mix</w:t>
+      </w:r>
+    </w:p>
+    <w:tbl>
+      <w:tblPr>
+        <w:tblStyle w:val="Table"/>
+        <w:tblW w:type="pct" w:w="5000"/>
+        <w:tblLook w:firstRow="0" w:lastRow="0" w:firstColumn="0" w:lastColumn="0" w:noHBand="0" w:noVBand="0" w:val="0000"/>
+        <w:jc w:val="start"/>
+        <w:tblLayout w:type="fixed"/>
+      </w:tblPr>
+      <w:tblGrid>
+        <w:gridCol w:w="7920"/>
+      </w:tblGrid>
+      <w:tr>
+        <w:tc>
+          <w:tcPr/>
+          <w:bookmarkStart w:id="113" w:name="fig-fleet-mix"/>
           <w:p>
             <w:pPr>
               <w:pStyle w:val="Compact"/>
@@ -4597,18 +4836,18 @@
                 <wp:inline>
                   <wp:extent cx="5334000" cy="5334000"/>
                   <wp:effectExtent b="0" l="0" r="0" t="0"/>
-                  <wp:docPr descr="" title="" id="102" name="Picture"/>
+                  <wp:docPr descr="" title="" id="111" name="Picture"/>
                   <a:graphic>
                     <a:graphicData uri="http://schemas.openxmlformats.org/drawingml/2006/picture">
                       <pic:pic>
                         <pic:nvPicPr>
-                          <pic:cNvPr descr="03-traffic_characterisation_files/figure-docx/fig-fleet-mix-1.png" id="103" name="Picture"/>
+                          <pic:cNvPr descr="03-traffic_characterisation_files/figure-docx/fig-fleet-mix-1.png" id="112" name="Picture"/>
                           <pic:cNvPicPr>
                             <a:picLocks noChangeArrowheads="1" noChangeAspect="1"/>
                           </pic:cNvPicPr>
                         </pic:nvPicPr>
                         <pic:blipFill>
-                          <a:blip r:embed="rId101"/>
+                          <a:blip r:embed="rId110"/>
                           <a:stretch>
                             <a:fillRect/>
                           </a:stretch>
@@ -4645,10 +4884,10 @@
               <w:pStyle w:val="ImageCaption"/>
             </w:pPr>
             <w:r>
-              <w:t xml:space="preserve">Figure 3.5: Fleet mix observed at the study airports in 2024</w:t>
+              <w:t xml:space="preserve">Figure 3.6: Fleet mix observed at the study airports in 2024</w:t>
             </w:r>
           </w:p>
-          <w:bookmarkEnd w:id="104"/>
+          <w:bookmarkEnd w:id="113"/>
         </w:tc>
       </w:tr>
     </w:tbl>
@@ -4661,7 +4900,7 @@
           <w:rPr>
             <w:rStyle w:val="Hyperlink"/>
           </w:rPr>
-          <w:t xml:space="preserve">Figure 3.5</w:t>
+          <w:t xml:space="preserve">Figure 3.6</w:t>
         </w:r>
       </w:hyperlink>
       <w:r>
@@ -4901,7 +5140,7 @@
       <w:tr>
         <w:tc>
           <w:tcPr/>
-          <w:bookmarkStart w:id="108" w:name="fig-fleetmix-timeline"/>
+          <w:bookmarkStart w:id="117" w:name="fig-fleetmix-timeline"/>
           <w:p>
             <w:pPr>
               <w:pStyle w:val="Compact"/>
@@ -4912,18 +5151,18 @@
                 <wp:inline>
                   <wp:extent cx="5334000" cy="6400800"/>
                   <wp:effectExtent b="0" l="0" r="0" t="0"/>
-                  <wp:docPr descr="" title="" id="106" name="Picture"/>
+                  <wp:docPr descr="" title="" id="115" name="Picture"/>
                   <a:graphic>
                     <a:graphicData uri="http://schemas.openxmlformats.org/drawingml/2006/picture">
                       <pic:pic>
                         <pic:nvPicPr>
-                          <pic:cNvPr descr="03-traffic_characterisation_files/figure-docx/fig-fleetmix-timeline-1.png" id="107" name="Picture"/>
+                          <pic:cNvPr descr="03-traffic_characterisation_files/figure-docx/fig-fleetmix-timeline-1.png" id="116" name="Picture"/>
                           <pic:cNvPicPr>
                             <a:picLocks noChangeArrowheads="1" noChangeAspect="1"/>
                           </pic:cNvPicPr>
                         </pic:nvPicPr>
                         <pic:blipFill>
-                          <a:blip r:embed="rId105"/>
+                          <a:blip r:embed="rId114"/>
                           <a:stretch>
                             <a:fillRect/>
                           </a:stretch>
@@ -4960,10 +5199,10 @@
               <w:pStyle w:val="ImageCaption"/>
             </w:pPr>
             <w:r>
-              <w:t xml:space="preserve">Figure 3.6: Fleet mix change over time observed at study airports</w:t>
+              <w:t xml:space="preserve">Figure 3.7: Fleet mix change over time observed at study airports</w:t>
             </w:r>
           </w:p>
-          <w:bookmarkEnd w:id="108"/>
+          <w:bookmarkEnd w:id="117"/>
         </w:tc>
       </w:tr>
     </w:tbl>
@@ -4982,7 +5221,7 @@
           <w:rPr>
             <w:rStyle w:val="Hyperlink"/>
           </w:rPr>
-          <w:t xml:space="preserve">Figure 3.6</w:t>
+          <w:t xml:space="preserve">Figure 3.7</w:t>
         </w:r>
       </w:hyperlink>
       <w:r>
@@ -5010,14 +5249,14 @@
         <w:rPr>
           <w:rStyle w:val="FootnoteReference"/>
         </w:rPr>
-        <w:footnoteReference w:id="109"/>
+        <w:footnoteReference w:id="118"/>
       </w:r>
       <w:r>
         <w:t xml:space="preserve">.</w:t>
       </w:r>
     </w:p>
-    <w:bookmarkEnd w:id="110"/>
-    <w:bookmarkStart w:id="111" w:name="summary-1"/>
+    <w:bookmarkEnd w:id="119"/>
+    <w:bookmarkStart w:id="120" w:name="summary-1"/>
     <w:p>
       <w:pPr>
         <w:pStyle w:val="Heading2"/>
@@ -5116,9 +5355,9 @@
         <w:t xml:space="preserve">The observed differences may impact - inter alia - separation and synchronisation of air traffic, and influence the observed performance reported in the other chapters of this report.</w:t>
       </w:r>
     </w:p>
-    <w:bookmarkEnd w:id="111"/>
-    <w:bookmarkEnd w:id="112"/>
-    <w:bookmarkStart w:id="168" w:name="predictability"/>
+    <w:bookmarkEnd w:id="120"/>
+    <w:bookmarkEnd w:id="121"/>
+    <w:bookmarkStart w:id="177" w:name="predictability"/>
     <w:p>
       <w:pPr>
         <w:pStyle w:val="Heading1"/>
@@ -5153,7 +5392,7 @@
         <w:t xml:space="preserve">This chapter focuses on arrival and departure punctuality as crucial predictability indicators.</w:t>
       </w:r>
     </w:p>
-    <w:bookmarkStart w:id="145" w:name="arrival-punctuality"/>
+    <w:bookmarkStart w:id="154" w:name="arrival-punctuality"/>
     <w:p>
       <w:pPr>
         <w:pStyle w:val="Heading2"/>
@@ -5162,7 +5401,7 @@
         <w:t xml:space="preserve">4.1 Arrival Punctuality</w:t>
       </w:r>
     </w:p>
-    <w:bookmarkStart w:id="117" w:name="fig-arrival-punc"/>
+    <w:bookmarkStart w:id="126" w:name="fig-arrival-punc"/>
     <w:tbl>
       <w:tblPr>
         <w:tblStyle w:val="Table"/>
@@ -5191,7 +5430,7 @@
             <w:tr>
               <w:tc>
                 <w:tcPr/>
-                <w:bookmarkStart w:id="116" w:name="fig-arrival-punc"/>
+                <w:bookmarkStart w:id="125" w:name="fig-arrival-punc"/>
                 <w:p>
                   <w:pPr>
                     <w:pStyle w:val="Compact"/>
@@ -5203,18 +5442,18 @@
                       <wp:inline>
                         <wp:extent cx="5334000" cy="4267200"/>
                         <wp:effectExtent b="0" l="0" r="0" t="0"/>
-                        <wp:docPr descr="" title="" id="114" name="Picture"/>
+                        <wp:docPr descr="" title="" id="123" name="Picture"/>
                         <a:graphic>
                           <a:graphicData uri="http://schemas.openxmlformats.org/drawingml/2006/picture">
                             <pic:pic>
                               <pic:nvPicPr>
-                                <pic:cNvPr descr="04-predictability_files/figure-docx/fig-arrival-punc-1.png" id="115" name="Picture"/>
+                                <pic:cNvPr descr="04-predictability_files/figure-docx/fig-arrival-punc-1.png" id="124" name="Picture"/>
                                 <pic:cNvPicPr>
                                   <a:picLocks noChangeArrowheads="1" noChangeAspect="1"/>
                                 </pic:cNvPicPr>
                               </pic:nvPicPr>
                               <pic:blipFill>
-                                <a:blip r:embed="rId113"/>
+                                <a:blip r:embed="rId122"/>
                                 <a:stretch>
                                   <a:fillRect/>
                                 </a:stretch>
@@ -5255,7 +5494,7 @@
                     <w:t xml:space="preserve">(a) Arrival punctuality 2023</w:t>
                   </w:r>
                 </w:p>
-                <w:bookmarkEnd w:id="116"/>
+                <w:bookmarkEnd w:id="125"/>
               </w:tc>
             </w:tr>
           </w:tbl>
@@ -5275,7 +5514,7 @@
         <w:t xml:space="preserve">Figure 4.1: Evolution of arrival punctuality at study airports (2023 vs 2024)</w:t>
       </w:r>
     </w:p>
-    <w:bookmarkEnd w:id="117"/>
+    <w:bookmarkEnd w:id="126"/>
     <w:p>
       <w:pPr>
         <w:pStyle w:val="BodyText"/>
@@ -5381,7 +5620,7 @@
       <w:tr>
         <w:tc>
           <w:tcPr/>
-          <w:bookmarkStart w:id="121" w:name="fig-evolution-ARR-punc"/>
+          <w:bookmarkStart w:id="130" w:name="fig-evolution-ARR-punc"/>
           <w:p>
             <w:pPr>
               <w:pStyle w:val="Compact"/>
@@ -5392,18 +5631,18 @@
                 <wp:inline>
                   <wp:extent cx="5334000" cy="4267200"/>
                   <wp:effectExtent b="0" l="0" r="0" t="0"/>
-                  <wp:docPr descr="" title="" id="119" name="Picture"/>
+                  <wp:docPr descr="" title="" id="128" name="Picture"/>
                   <a:graphic>
                     <a:graphicData uri="http://schemas.openxmlformats.org/drawingml/2006/picture">
                       <pic:pic>
                         <pic:nvPicPr>
-                          <pic:cNvPr descr="04-predictability_files/figure-docx/fig-evolution-ARR-punc-1.png" id="120" name="Picture"/>
+                          <pic:cNvPr descr="04-predictability_files/figure-docx/fig-evolution-ARR-punc-1.png" id="129" name="Picture"/>
                           <pic:cNvPicPr>
                             <a:picLocks noChangeArrowheads="1" noChangeAspect="1"/>
                           </pic:cNvPicPr>
                         </pic:nvPicPr>
                         <pic:blipFill>
-                          <a:blip r:embed="rId118"/>
+                          <a:blip r:embed="rId127"/>
                           <a:stretch>
                             <a:fillRect/>
                           </a:stretch>
@@ -5443,7 +5682,7 @@
               <w:t xml:space="preserve">Figure 4.2: Evolution of arrival punctuality window</w:t>
             </w:r>
           </w:p>
-          <w:bookmarkEnd w:id="121"/>
+          <w:bookmarkEnd w:id="130"/>
         </w:tc>
       </w:tr>
     </w:tbl>
@@ -5484,12 +5723,12 @@
                 <wp:inline>
                   <wp:extent cx="152400" cy="152400"/>
                   <wp:effectExtent b="0" l="0" r="0" t="0"/>
-                  <wp:docPr descr="" title="" id="122" name="Picture"/>
+                  <wp:docPr descr="" title="" id="131" name="Picture"/>
                   <a:graphic>
                     <a:graphicData uri="http://schemas.openxmlformats.org/drawingml/2006/picture">
                       <pic:pic>
                         <pic:nvPicPr>
-                          <pic:cNvPr descr="/Applications/quarto/share/formats/docx/note.png" id="123" name="Picture"/>
+                          <pic:cNvPr descr="/Applications/quarto/share/formats/docx/note.png" id="132" name="Picture"/>
                           <pic:cNvPicPr>
                             <a:picLocks noChangeArrowheads="1" noChangeAspect="1"/>
                           </pic:cNvPicPr>
@@ -5560,7 +5799,7 @@
       <w:tr>
         <w:tc>
           <w:tcPr/>
-          <w:bookmarkStart w:id="127" w:name="fig-evolution-ARR-punc_by_month"/>
+          <w:bookmarkStart w:id="136" w:name="fig-evolution-ARR-punc_by_month"/>
           <w:p>
             <w:pPr>
               <w:pStyle w:val="Compact"/>
@@ -5571,18 +5810,18 @@
                 <wp:inline>
                   <wp:extent cx="5334000" cy="4267200"/>
                   <wp:effectExtent b="0" l="0" r="0" t="0"/>
-                  <wp:docPr descr="" title="" id="125" name="Picture"/>
+                  <wp:docPr descr="" title="" id="134" name="Picture"/>
                   <a:graphic>
                     <a:graphicData uri="http://schemas.openxmlformats.org/drawingml/2006/picture">
                       <pic:pic>
                         <pic:nvPicPr>
-                          <pic:cNvPr descr="04-predictability_files/figure-docx/fig-evolution-ARR-punc_by_month-1.png" id="126" name="Picture"/>
+                          <pic:cNvPr descr="04-predictability_files/figure-docx/fig-evolution-ARR-punc_by_month-1.png" id="135" name="Picture"/>
                           <pic:cNvPicPr>
                             <a:picLocks noChangeArrowheads="1" noChangeAspect="1"/>
                           </pic:cNvPicPr>
                         </pic:nvPicPr>
                         <pic:blipFill>
-                          <a:blip r:embed="rId124"/>
+                          <a:blip r:embed="rId133"/>
                           <a:stretch>
                             <a:fillRect/>
                           </a:stretch>
@@ -5622,195 +5861,10 @@
               <w:t xml:space="preserve">Figure 4.3: Evolution of arrival punctuality window by month</w:t>
             </w:r>
           </w:p>
-          <w:bookmarkEnd w:id="127"/>
+          <w:bookmarkEnd w:id="136"/>
         </w:tc>
       </w:tr>
     </w:tbl>
-    <w:p>
-      <w:pPr>
-        <w:pStyle w:val="BodyText"/>
-      </w:pPr>
-      <w:r>
-        <w:drawing>
-          <wp:inline>
-            <wp:extent cx="5334000" cy="4267200"/>
-            <wp:effectExtent b="0" l="0" r="0" t="0"/>
-            <wp:docPr descr="" title="" id="129" name="Picture"/>
-            <a:graphic>
-              <a:graphicData uri="http://schemas.openxmlformats.org/drawingml/2006/picture">
-                <pic:pic>
-                  <pic:nvPicPr>
-                    <pic:cNvPr descr="04-predictability_files/figure-docx/unnamed-chunk-5-1.png" id="130" name="Picture"/>
-                    <pic:cNvPicPr>
-                      <a:picLocks noChangeArrowheads="1" noChangeAspect="1"/>
-                    </pic:cNvPicPr>
-                  </pic:nvPicPr>
-                  <pic:blipFill>
-                    <a:blip r:embed="rId128"/>
-                    <a:stretch>
-                      <a:fillRect/>
-                    </a:stretch>
-                  </pic:blipFill>
-                  <pic:spPr bwMode="auto">
-                    <a:xfrm>
-                      <a:off x="0" y="0"/>
-                      <a:ext cx="5334000" cy="4267200"/>
-                    </a:xfrm>
-                    <a:prstGeom prst="rect">
-                      <a:avLst/>
-                    </a:prstGeom>
-                    <a:noFill/>
-                    <a:ln w="9525">
-                      <a:noFill/>
-                      <a:headEnd/>
-                      <a:tailEnd/>
-                    </a:ln>
-                  </pic:spPr>
-                </pic:pic>
-              </a:graphicData>
-            </a:graphic>
-          </wp:inline>
-        </w:drawing>
-      </w:r>
-    </w:p>
-    <w:p>
-      <w:pPr>
-        <w:pStyle w:val="BodyText"/>
-      </w:pPr>
-      <w:r>
-        <w:drawing>
-          <wp:inline>
-            <wp:extent cx="5334000" cy="4267200"/>
-            <wp:effectExtent b="0" l="0" r="0" t="0"/>
-            <wp:docPr descr="" title="" id="132" name="Picture"/>
-            <a:graphic>
-              <a:graphicData uri="http://schemas.openxmlformats.org/drawingml/2006/picture">
-                <pic:pic>
-                  <pic:nvPicPr>
-                    <pic:cNvPr descr="04-predictability_files/figure-docx/unnamed-chunk-6-1.png" id="133" name="Picture"/>
-                    <pic:cNvPicPr>
-                      <a:picLocks noChangeArrowheads="1" noChangeAspect="1"/>
-                    </pic:cNvPicPr>
-                  </pic:nvPicPr>
-                  <pic:blipFill>
-                    <a:blip r:embed="rId131"/>
-                    <a:stretch>
-                      <a:fillRect/>
-                    </a:stretch>
-                  </pic:blipFill>
-                  <pic:spPr bwMode="auto">
-                    <a:xfrm>
-                      <a:off x="0" y="0"/>
-                      <a:ext cx="5334000" cy="4267200"/>
-                    </a:xfrm>
-                    <a:prstGeom prst="rect">
-                      <a:avLst/>
-                    </a:prstGeom>
-                    <a:noFill/>
-                    <a:ln w="9525">
-                      <a:noFill/>
-                      <a:headEnd/>
-                      <a:tailEnd/>
-                    </a:ln>
-                  </pic:spPr>
-                </pic:pic>
-              </a:graphicData>
-            </a:graphic>
-          </wp:inline>
-        </w:drawing>
-      </w:r>
-    </w:p>
-    <w:p>
-      <w:pPr>
-        <w:pStyle w:val="BodyText"/>
-      </w:pPr>
-      <w:r>
-        <w:t xml:space="preserve">European airports saw their share of punctual flights in 2022 decrease broadly compared to 2019, even with a more proportional distribution than the Brazilian system.</w:t>
-      </w:r>
-      <w:r>
-        <w:t xml:space="preserve"> </w:t>
-      </w:r>
-      <w:r>
-        <w:t xml:space="preserve">For European operators, there were two primary factors contributing the the lower performance in 2022.</w:t>
-      </w:r>
-      <w:r>
-        <w:t xml:space="preserve"> </w:t>
-      </w:r>
-      <w:r>
-        <w:t xml:space="preserve">The most significant is the cumulative effect, showing that the network of flights has little ability to absorb the delay of one specific delayed flight.</w:t>
-      </w:r>
-      <w:r>
-        <w:t xml:space="preserve"> </w:t>
-      </w:r>
-      <w:r>
-        <w:t xml:space="preserve">The knock-on effect was amplified by the local resource constraints in terms of passenger and turn-around facilitation.</w:t>
-      </w:r>
-      <w:r>
-        <w:t xml:space="preserve"> </w:t>
-      </w:r>
-      <w:r>
-        <w:t xml:space="preserve">The incrasing traffic demand posed challenges at many airports in Europe. Delayed arrivals accumulated further reactionary delay and ultimately passed the delay systematically on to next flights.</w:t>
-      </w:r>
-      <w:r>
-        <w:t xml:space="preserve"> </w:t>
-      </w:r>
-      <w:r>
-        <w:t xml:space="preserve">Further constraints were linked to air space and flow restrictions resulting from the geo-political conflict surrounding the Russian invasion in Ukraine.</w:t>
-      </w:r>
-      <w:r>
-        <w:t xml:space="preserve"> </w:t>
-      </w:r>
-      <w:r>
-        <w:t xml:space="preserve">On average, arrival delays of 15 minutes or more compared to the schedule ranged between 25-35% across the Europen study airports in 2022.</w:t>
-      </w:r>
-    </w:p>
-    <w:p>
-      <w:pPr>
-        <w:pStyle w:val="BodyText"/>
-      </w:pPr>
-      <w:r>
-        <w:drawing>
-          <wp:inline>
-            <wp:extent cx="5334000" cy="4267200"/>
-            <wp:effectExtent b="0" l="0" r="0" t="0"/>
-            <wp:docPr descr="" title="" id="135" name="Picture"/>
-            <a:graphic>
-              <a:graphicData uri="http://schemas.openxmlformats.org/drawingml/2006/picture">
-                <pic:pic>
-                  <pic:nvPicPr>
-                    <pic:cNvPr descr="04-predictability_files/figure-docx/unnamed-chunk-7-1.png" id="136" name="Picture"/>
-                    <pic:cNvPicPr>
-                      <a:picLocks noChangeArrowheads="1" noChangeAspect="1"/>
-                    </pic:cNvPicPr>
-                  </pic:nvPicPr>
-                  <pic:blipFill>
-                    <a:blip r:embed="rId134"/>
-                    <a:stretch>
-                      <a:fillRect/>
-                    </a:stretch>
-                  </pic:blipFill>
-                  <pic:spPr bwMode="auto">
-                    <a:xfrm>
-                      <a:off x="0" y="0"/>
-                      <a:ext cx="5334000" cy="4267200"/>
-                    </a:xfrm>
-                    <a:prstGeom prst="rect">
-                      <a:avLst/>
-                    </a:prstGeom>
-                    <a:noFill/>
-                    <a:ln w="9525">
-                      <a:noFill/>
-                      <a:headEnd/>
-                      <a:tailEnd/>
-                    </a:ln>
-                  </pic:spPr>
-                </pic:pic>
-              </a:graphicData>
-            </a:graphic>
-          </wp:inline>
-        </w:drawing>
-      </w:r>
-    </w:p>
     <w:p>
       <w:pPr>
         <w:pStyle w:val="BodyText"/>
@@ -5825,7 +5879,7 @@
               <a:graphicData uri="http://schemas.openxmlformats.org/drawingml/2006/picture">
                 <pic:pic>
                   <pic:nvPicPr>
-                    <pic:cNvPr descr="04-predictability_files/figure-docx/unnamed-chunk-8-1.png" id="139" name="Picture"/>
+                    <pic:cNvPr descr="04-predictability_files/figure-docx/unnamed-chunk-5-1.png" id="139" name="Picture"/>
                     <pic:cNvPicPr>
                       <a:picLocks noChangeArrowheads="1" noChangeAspect="1"/>
                     </pic:cNvPicPr>
@@ -5858,6 +5912,191 @@
         </w:drawing>
       </w:r>
     </w:p>
+    <w:p>
+      <w:pPr>
+        <w:pStyle w:val="BodyText"/>
+      </w:pPr>
+      <w:r>
+        <w:drawing>
+          <wp:inline>
+            <wp:extent cx="5334000" cy="4267200"/>
+            <wp:effectExtent b="0" l="0" r="0" t="0"/>
+            <wp:docPr descr="" title="" id="141" name="Picture"/>
+            <a:graphic>
+              <a:graphicData uri="http://schemas.openxmlformats.org/drawingml/2006/picture">
+                <pic:pic>
+                  <pic:nvPicPr>
+                    <pic:cNvPr descr="04-predictability_files/figure-docx/unnamed-chunk-6-1.png" id="142" name="Picture"/>
+                    <pic:cNvPicPr>
+                      <a:picLocks noChangeArrowheads="1" noChangeAspect="1"/>
+                    </pic:cNvPicPr>
+                  </pic:nvPicPr>
+                  <pic:blipFill>
+                    <a:blip r:embed="rId140"/>
+                    <a:stretch>
+                      <a:fillRect/>
+                    </a:stretch>
+                  </pic:blipFill>
+                  <pic:spPr bwMode="auto">
+                    <a:xfrm>
+                      <a:off x="0" y="0"/>
+                      <a:ext cx="5334000" cy="4267200"/>
+                    </a:xfrm>
+                    <a:prstGeom prst="rect">
+                      <a:avLst/>
+                    </a:prstGeom>
+                    <a:noFill/>
+                    <a:ln w="9525">
+                      <a:noFill/>
+                      <a:headEnd/>
+                      <a:tailEnd/>
+                    </a:ln>
+                  </pic:spPr>
+                </pic:pic>
+              </a:graphicData>
+            </a:graphic>
+          </wp:inline>
+        </w:drawing>
+      </w:r>
+    </w:p>
+    <w:p>
+      <w:pPr>
+        <w:pStyle w:val="BodyText"/>
+      </w:pPr>
+      <w:r>
+        <w:t xml:space="preserve">European airports saw their share of punctual flights in 2022 decrease broadly compared to 2019, even with a more proportional distribution than the Brazilian system.</w:t>
+      </w:r>
+      <w:r>
+        <w:t xml:space="preserve"> </w:t>
+      </w:r>
+      <w:r>
+        <w:t xml:space="preserve">For European operators, there were two primary factors contributing the the lower performance in 2022.</w:t>
+      </w:r>
+      <w:r>
+        <w:t xml:space="preserve"> </w:t>
+      </w:r>
+      <w:r>
+        <w:t xml:space="preserve">The most significant is the cumulative effect, showing that the network of flights has little ability to absorb the delay of one specific delayed flight.</w:t>
+      </w:r>
+      <w:r>
+        <w:t xml:space="preserve"> </w:t>
+      </w:r>
+      <w:r>
+        <w:t xml:space="preserve">The knock-on effect was amplified by the local resource constraints in terms of passenger and turn-around facilitation.</w:t>
+      </w:r>
+      <w:r>
+        <w:t xml:space="preserve"> </w:t>
+      </w:r>
+      <w:r>
+        <w:t xml:space="preserve">The incrasing traffic demand posed challenges at many airports in Europe. Delayed arrivals accumulated further reactionary delay and ultimately passed the delay systematically on to next flights.</w:t>
+      </w:r>
+      <w:r>
+        <w:t xml:space="preserve"> </w:t>
+      </w:r>
+      <w:r>
+        <w:t xml:space="preserve">Further constraints were linked to air space and flow restrictions resulting from the geo-political conflict surrounding the Russian invasion in Ukraine.</w:t>
+      </w:r>
+      <w:r>
+        <w:t xml:space="preserve"> </w:t>
+      </w:r>
+      <w:r>
+        <w:t xml:space="preserve">On average, arrival delays of 15 minutes or more compared to the schedule ranged between 25-35% across the Europen study airports in 2022.</w:t>
+      </w:r>
+    </w:p>
+    <w:p>
+      <w:pPr>
+        <w:pStyle w:val="BodyText"/>
+      </w:pPr>
+      <w:r>
+        <w:drawing>
+          <wp:inline>
+            <wp:extent cx="5334000" cy="4267200"/>
+            <wp:effectExtent b="0" l="0" r="0" t="0"/>
+            <wp:docPr descr="" title="" id="144" name="Picture"/>
+            <a:graphic>
+              <a:graphicData uri="http://schemas.openxmlformats.org/drawingml/2006/picture">
+                <pic:pic>
+                  <pic:nvPicPr>
+                    <pic:cNvPr descr="04-predictability_files/figure-docx/unnamed-chunk-7-1.png" id="145" name="Picture"/>
+                    <pic:cNvPicPr>
+                      <a:picLocks noChangeArrowheads="1" noChangeAspect="1"/>
+                    </pic:cNvPicPr>
+                  </pic:nvPicPr>
+                  <pic:blipFill>
+                    <a:blip r:embed="rId143"/>
+                    <a:stretch>
+                      <a:fillRect/>
+                    </a:stretch>
+                  </pic:blipFill>
+                  <pic:spPr bwMode="auto">
+                    <a:xfrm>
+                      <a:off x="0" y="0"/>
+                      <a:ext cx="5334000" cy="4267200"/>
+                    </a:xfrm>
+                    <a:prstGeom prst="rect">
+                      <a:avLst/>
+                    </a:prstGeom>
+                    <a:noFill/>
+                    <a:ln w="9525">
+                      <a:noFill/>
+                      <a:headEnd/>
+                      <a:tailEnd/>
+                    </a:ln>
+                  </pic:spPr>
+                </pic:pic>
+              </a:graphicData>
+            </a:graphic>
+          </wp:inline>
+        </w:drawing>
+      </w:r>
+    </w:p>
+    <w:p>
+      <w:pPr>
+        <w:pStyle w:val="BodyText"/>
+      </w:pPr>
+      <w:r>
+        <w:drawing>
+          <wp:inline>
+            <wp:extent cx="5334000" cy="4267200"/>
+            <wp:effectExtent b="0" l="0" r="0" t="0"/>
+            <wp:docPr descr="" title="" id="147" name="Picture"/>
+            <a:graphic>
+              <a:graphicData uri="http://schemas.openxmlformats.org/drawingml/2006/picture">
+                <pic:pic>
+                  <pic:nvPicPr>
+                    <pic:cNvPr descr="04-predictability_files/figure-docx/unnamed-chunk-8-1.png" id="148" name="Picture"/>
+                    <pic:cNvPicPr>
+                      <a:picLocks noChangeArrowheads="1" noChangeAspect="1"/>
+                    </pic:cNvPicPr>
+                  </pic:nvPicPr>
+                  <pic:blipFill>
+                    <a:blip r:embed="rId146"/>
+                    <a:stretch>
+                      <a:fillRect/>
+                    </a:stretch>
+                  </pic:blipFill>
+                  <pic:spPr bwMode="auto">
+                    <a:xfrm>
+                      <a:off x="0" y="0"/>
+                      <a:ext cx="5334000" cy="4267200"/>
+                    </a:xfrm>
+                    <a:prstGeom prst="rect">
+                      <a:avLst/>
+                    </a:prstGeom>
+                    <a:noFill/>
+                    <a:ln w="9525">
+                      <a:noFill/>
+                      <a:headEnd/>
+                      <a:tailEnd/>
+                    </a:ln>
+                  </pic:spPr>
+                </pic:pic>
+              </a:graphicData>
+            </a:graphic>
+          </wp:inline>
+        </w:drawing>
+      </w:r>
+    </w:p>
     <w:tbl>
       <w:tblPr>
         <w:tblStyle w:val="Table"/>
@@ -5872,7 +6111,7 @@
       <w:tr>
         <w:tc>
           <w:tcPr/>
-          <w:bookmarkStart w:id="143" w:name="fig-early-vs-late-arrivals"/>
+          <w:bookmarkStart w:id="152" w:name="fig-early-vs-late-arrivals"/>
           <w:p>
             <w:pPr>
               <w:pStyle w:val="Compact"/>
@@ -5883,18 +6122,18 @@
                 <wp:inline>
                   <wp:extent cx="5334000" cy="4267200"/>
                   <wp:effectExtent b="0" l="0" r="0" t="0"/>
-                  <wp:docPr descr="" title="" id="141" name="Picture"/>
+                  <wp:docPr descr="" title="" id="150" name="Picture"/>
                   <a:graphic>
                     <a:graphicData uri="http://schemas.openxmlformats.org/drawingml/2006/picture">
                       <pic:pic>
                         <pic:nvPicPr>
-                          <pic:cNvPr descr="04-predictability_files/figure-docx/fig-early-vs-late-arrivals-1.png" id="142" name="Picture"/>
+                          <pic:cNvPr descr="04-predictability_files/figure-docx/fig-early-vs-late-arrivals-1.png" id="151" name="Picture"/>
                           <pic:cNvPicPr>
                             <a:picLocks noChangeArrowheads="1" noChangeAspect="1"/>
                           </pic:cNvPicPr>
                         </pic:nvPicPr>
                         <pic:blipFill>
-                          <a:blip r:embed="rId140"/>
+                          <a:blip r:embed="rId149"/>
                           <a:stretch>
                             <a:fillRect/>
                           </a:stretch>
@@ -5934,7 +6173,7 @@
               <w:t xml:space="preserve">Figure 4.4: Change of share of early and late arrivals (2019 vs 2022)</w:t>
             </w:r>
           </w:p>
-          <w:bookmarkEnd w:id="143"/>
+          <w:bookmarkEnd w:id="152"/>
         </w:tc>
       </w:tr>
     </w:tbl>
@@ -6035,14 +6274,14 @@
         <w:rPr>
           <w:rStyle w:val="FootnoteReference"/>
         </w:rPr>
-        <w:footnoteReference w:id="144"/>
+        <w:footnoteReference w:id="153"/>
       </w:r>
       <w:r>
         <w:t xml:space="preserve">.</w:t>
       </w:r>
     </w:p>
-    <w:bookmarkEnd w:id="145"/>
-    <w:bookmarkStart w:id="166" w:name="departure-punctuality"/>
+    <w:bookmarkEnd w:id="154"/>
+    <w:bookmarkStart w:id="175" w:name="departure-punctuality"/>
     <w:p>
       <w:pPr>
         <w:pStyle w:val="Heading2"/>
@@ -6051,7 +6290,7 @@
         <w:t xml:space="preserve">4.2 Departure Punctuality</w:t>
       </w:r>
     </w:p>
-    <w:bookmarkStart w:id="150" w:name="fig-departure-punc"/>
+    <w:bookmarkStart w:id="159" w:name="fig-departure-punc"/>
     <w:tbl>
       <w:tblPr>
         <w:tblStyle w:val="Table"/>
@@ -6080,7 +6319,7 @@
             <w:tr>
               <w:tc>
                 <w:tcPr/>
-                <w:bookmarkStart w:id="149" w:name="fig-departure-punc"/>
+                <w:bookmarkStart w:id="158" w:name="fig-departure-punc"/>
                 <w:p>
                   <w:pPr>
                     <w:pStyle w:val="Compact"/>
@@ -6092,18 +6331,18 @@
                       <wp:inline>
                         <wp:extent cx="5334000" cy="4267200"/>
                         <wp:effectExtent b="0" l="0" r="0" t="0"/>
-                        <wp:docPr descr="" title="" id="147" name="Picture"/>
+                        <wp:docPr descr="" title="" id="156" name="Picture"/>
                         <a:graphic>
                           <a:graphicData uri="http://schemas.openxmlformats.org/drawingml/2006/picture">
                             <pic:pic>
                               <pic:nvPicPr>
-                                <pic:cNvPr descr="04-predictability_files/figure-docx/fig-departure-punc-1.png" id="148" name="Picture"/>
+                                <pic:cNvPr descr="04-predictability_files/figure-docx/fig-departure-punc-1.png" id="157" name="Picture"/>
                                 <pic:cNvPicPr>
                                   <a:picLocks noChangeArrowheads="1" noChangeAspect="1"/>
                                 </pic:cNvPicPr>
                               </pic:nvPicPr>
                               <pic:blipFill>
-                                <a:blip r:embed="rId146"/>
+                                <a:blip r:embed="rId155"/>
                                 <a:stretch>
                                   <a:fillRect/>
                                 </a:stretch>
@@ -6144,7 +6383,7 @@
                     <w:t xml:space="preserve">(a) Departure punctuality 2023</w:t>
                   </w:r>
                 </w:p>
-                <w:bookmarkEnd w:id="149"/>
+                <w:bookmarkEnd w:id="158"/>
               </w:tc>
             </w:tr>
           </w:tbl>
@@ -6164,7 +6403,7 @@
         <w:t xml:space="preserve">Figure 4.5: Evolution of departure punctuality at study airports (2023 vs 2024)</w:t>
       </w:r>
     </w:p>
-    <w:bookmarkEnd w:id="150"/>
+    <w:bookmarkEnd w:id="159"/>
     <w:tbl>
       <w:tblPr>
         <w:tblStyle w:val="Table"/>
@@ -6179,7 +6418,7 @@
       <w:tr>
         <w:tc>
           <w:tcPr/>
-          <w:bookmarkStart w:id="154" w:name="fig-evolution-DEP-punc"/>
+          <w:bookmarkStart w:id="163" w:name="fig-evolution-DEP-punc"/>
           <w:p>
             <w:pPr>
               <w:pStyle w:val="Compact"/>
@@ -6190,18 +6429,18 @@
                 <wp:inline>
                   <wp:extent cx="5334000" cy="4267200"/>
                   <wp:effectExtent b="0" l="0" r="0" t="0"/>
-                  <wp:docPr descr="" title="" id="152" name="Picture"/>
+                  <wp:docPr descr="" title="" id="161" name="Picture"/>
                   <a:graphic>
                     <a:graphicData uri="http://schemas.openxmlformats.org/drawingml/2006/picture">
                       <pic:pic>
                         <pic:nvPicPr>
-                          <pic:cNvPr descr="04-predictability_files/figure-docx/fig-evolution-DEP-punc-1.png" id="153" name="Picture"/>
+                          <pic:cNvPr descr="04-predictability_files/figure-docx/fig-evolution-DEP-punc-1.png" id="162" name="Picture"/>
                           <pic:cNvPicPr>
                             <a:picLocks noChangeArrowheads="1" noChangeAspect="1"/>
                           </pic:cNvPicPr>
                         </pic:nvPicPr>
                         <pic:blipFill>
-                          <a:blip r:embed="rId151"/>
+                          <a:blip r:embed="rId160"/>
                           <a:stretch>
                             <a:fillRect/>
                           </a:stretch>
@@ -6241,7 +6480,7 @@
               <w:t xml:space="preserve">Figure 4.6: Evolution of departure punctuality window</w:t>
             </w:r>
           </w:p>
-          <w:bookmarkEnd w:id="154"/>
+          <w:bookmarkEnd w:id="163"/>
         </w:tc>
       </w:tr>
     </w:tbl>
@@ -6259,7 +6498,7 @@
       <w:tr>
         <w:tc>
           <w:tcPr/>
-          <w:bookmarkStart w:id="158" w:name="fig-evolution-DEP-punc_by_month"/>
+          <w:bookmarkStart w:id="167" w:name="fig-evolution-DEP-punc_by_month"/>
           <w:p>
             <w:pPr>
               <w:pStyle w:val="Compact"/>
@@ -6270,18 +6509,18 @@
                 <wp:inline>
                   <wp:extent cx="5334000" cy="4267200"/>
                   <wp:effectExtent b="0" l="0" r="0" t="0"/>
-                  <wp:docPr descr="" title="" id="156" name="Picture"/>
+                  <wp:docPr descr="" title="" id="165" name="Picture"/>
                   <a:graphic>
                     <a:graphicData uri="http://schemas.openxmlformats.org/drawingml/2006/picture">
                       <pic:pic>
                         <pic:nvPicPr>
-                          <pic:cNvPr descr="04-predictability_files/figure-docx/fig-evolution-DEP-punc_by_month-1.png" id="157" name="Picture"/>
+                          <pic:cNvPr descr="04-predictability_files/figure-docx/fig-evolution-DEP-punc_by_month-1.png" id="166" name="Picture"/>
                           <pic:cNvPicPr>
                             <a:picLocks noChangeArrowheads="1" noChangeAspect="1"/>
                           </pic:cNvPicPr>
                         </pic:nvPicPr>
                         <pic:blipFill>
-                          <a:blip r:embed="rId155"/>
+                          <a:blip r:embed="rId164"/>
                           <a:stretch>
                             <a:fillRect/>
                           </a:stretch>
@@ -6321,7 +6560,7 @@
               <w:t xml:space="preserve">Figure 4.7: Evolution of arrival punctuality window by month</w:t>
             </w:r>
           </w:p>
-          <w:bookmarkEnd w:id="158"/>
+          <w:bookmarkEnd w:id="167"/>
         </w:tc>
       </w:tr>
     </w:tbl>
@@ -6428,7 +6667,7 @@
       <w:tr>
         <w:tc>
           <w:tcPr/>
-          <w:bookmarkStart w:id="162" w:name="fig-early-vs-late-departures"/>
+          <w:bookmarkStart w:id="171" w:name="fig-early-vs-late-departures"/>
           <w:p>
             <w:pPr>
               <w:pStyle w:val="Compact"/>
@@ -6439,18 +6678,18 @@
                 <wp:inline>
                   <wp:extent cx="5334000" cy="4267200"/>
                   <wp:effectExtent b="0" l="0" r="0" t="0"/>
-                  <wp:docPr descr="" title="" id="160" name="Picture"/>
+                  <wp:docPr descr="" title="" id="169" name="Picture"/>
                   <a:graphic>
                     <a:graphicData uri="http://schemas.openxmlformats.org/drawingml/2006/picture">
                       <pic:pic>
                         <pic:nvPicPr>
-                          <pic:cNvPr descr="04-predictability_files/figure-docx/fig-early-vs-late-departures-1.png" id="161" name="Picture"/>
+                          <pic:cNvPr descr="04-predictability_files/figure-docx/fig-early-vs-late-departures-1.png" id="170" name="Picture"/>
                           <pic:cNvPicPr>
                             <a:picLocks noChangeArrowheads="1" noChangeAspect="1"/>
                           </pic:cNvPicPr>
                         </pic:nvPicPr>
                         <pic:blipFill>
-                          <a:blip r:embed="rId159"/>
+                          <a:blip r:embed="rId168"/>
                           <a:stretch>
                             <a:fillRect/>
                           </a:stretch>
@@ -6490,7 +6729,7 @@
               <w:t xml:space="preserve">Figure 4.8: Change of share of early and late departures (2023 vs 2024)</w:t>
             </w:r>
           </w:p>
-          <w:bookmarkEnd w:id="162"/>
+          <w:bookmarkEnd w:id="171"/>
         </w:tc>
       </w:tr>
     </w:tbl>
@@ -6503,18 +6742,18 @@
           <wp:inline>
             <wp:extent cx="5334000" cy="4267200"/>
             <wp:effectExtent b="0" l="0" r="0" t="0"/>
-            <wp:docPr descr="" title="" id="164" name="Picture"/>
+            <wp:docPr descr="" title="" id="173" name="Picture"/>
             <a:graphic>
               <a:graphicData uri="http://schemas.openxmlformats.org/drawingml/2006/picture">
                 <pic:pic>
                   <pic:nvPicPr>
-                    <pic:cNvPr descr="04-predictability_files/figure-docx/unnamed-chunk-14-1.png" id="165" name="Picture"/>
+                    <pic:cNvPr descr="04-predictability_files/figure-docx/unnamed-chunk-14-1.png" id="174" name="Picture"/>
                     <pic:cNvPicPr>
                       <a:picLocks noChangeArrowheads="1" noChangeAspect="1"/>
                     </pic:cNvPicPr>
                   </pic:nvPicPr>
                   <pic:blipFill>
-                    <a:blip r:embed="rId163"/>
+                    <a:blip r:embed="rId172"/>
                     <a:stretch>
                       <a:fillRect/>
                     </a:stretch>
@@ -6593,8 +6832,8 @@
         <w:t xml:space="preserve">Local issues (e.g. reduced facilication capacity at airports) affected air traffic services in terms of surface movement, but also rippled into the network affecting the sequencing of arrivals and departure traffic.</w:t>
       </w:r>
     </w:p>
-    <w:bookmarkEnd w:id="166"/>
-    <w:bookmarkStart w:id="167" w:name="summary-2"/>
+    <w:bookmarkEnd w:id="175"/>
+    <w:bookmarkStart w:id="176" w:name="summary-2"/>
     <w:p>
       <w:pPr>
         <w:pStyle w:val="Heading2"/>
@@ -6661,143 +6900,752 @@
         <w:t xml:space="preserve">More research is needed to investigate and understand the underlying drivers and to what extent regional connectivity influences the observed patterns.</w:t>
       </w:r>
     </w:p>
-    <w:bookmarkEnd w:id="167"/>
-    <w:bookmarkEnd w:id="168"/>
-    <w:bookmarkStart w:id="169" w:name="dumping-lot"/>
+    <w:bookmarkEnd w:id="176"/>
+    <w:bookmarkEnd w:id="177"/>
+    <w:bookmarkStart w:id="184" w:name="conclusions"/>
     <w:p>
       <w:pPr>
         <w:pStyle w:val="Heading1"/>
       </w:pPr>
       <w:r>
-        <w:t xml:space="preserve">5. dumping lot</w:t>
-      </w:r>
-    </w:p>
-    <w:p>
-      <w:pPr>
-        <w:pStyle w:val="FirstParagraph"/>
-      </w:pPr>
-      <w:r>
-        <w:t xml:space="preserve">This is text we should add to chapter 4.</w:t>
-      </w:r>
-    </w:p>
+        <w:t xml:space="preserve">5. Conclusions</w:t>
+      </w:r>
+    </w:p>
+    <w:tbl>
+      <w:tblPr>
+        <w:tblStyle w:val="Table"/>
+        <w:tblLook w:firstRow="0" w:lastRow="0" w:firstColumn="0" w:lastColumn="0" w:noHBand="0" w:noVBand="0" w:val="0000"/>
+        <w:tblBorders>
+          <w:left w:val="single" w:sz="24" w:space="0" w:color="0758E5"/>
+        </w:tblBorders>
+        <w:tblCellMar>
+          <w:left w:w="0" w:type="dxa"/>
+          <w:right w:w="0" w:type="dxa"/>
+        </w:tblCellMar>
+        <w:tblInd w:w="164" w:type="dxa"/>
+      </w:tblPr>
+      <w:tr>
+        <w:trPr>
+          <w:cantSplit/>
+        </w:trPr>
+        <w:tc>
+          <w:tcPr>
+            <w:tcMar>
+              <w:left w:w="144" w:type="dxa"/>
+              <w:right w:w="144" w:type="dxa"/>
+            </w:tcMar>
+          </w:tcPr>
+          <w:p>
+            <w:pPr>
+              <w:pStyle w:val="FirstParagraph"/>
+            </w:pPr>
+            <w:pPr>
+              <w:spacing w:before="0" w:after="8"/>
+              <w:jc w:val="center"/>
+            </w:pPr>
+            <w:r>
+              <w:drawing>
+                <wp:inline>
+                  <wp:extent cx="152400" cy="152400"/>
+                  <wp:effectExtent b="0" l="0" r="0" t="0"/>
+                  <wp:docPr descr="" title="" id="178" name="Picture"/>
+                  <a:graphic>
+                    <a:graphicData uri="http://schemas.openxmlformats.org/drawingml/2006/picture">
+                      <pic:pic>
+                        <pic:nvPicPr>
+                          <pic:cNvPr descr="/Applications/quarto/share/formats/docx/note.png" id="179" name="Picture"/>
+                          <pic:cNvPicPr>
+                            <a:picLocks noChangeArrowheads="1" noChangeAspect="1"/>
+                          </pic:cNvPicPr>
+                        </pic:nvPicPr>
+                        <pic:blipFill>
+                          <a:blip r:embed="rId63"/>
+                          <a:stretch>
+                            <a:fillRect/>
+                          </a:stretch>
+                        </pic:blipFill>
+                        <pic:spPr bwMode="auto">
+                          <a:xfrm>
+                            <a:off x="0" y="0"/>
+                            <a:ext cx="152400" cy="152400"/>
+                          </a:xfrm>
+                          <a:prstGeom prst="rect">
+                            <a:avLst/>
+                          </a:prstGeom>
+                          <a:noFill/>
+                          <a:ln w="9525">
+                            <a:noFill/>
+                            <a:headEnd/>
+                            <a:tailEnd/>
+                          </a:ln>
+                        </pic:spPr>
+                      </pic:pic>
+                    </a:graphicData>
+                  </a:graphic>
+                </wp:inline>
+              </w:drawing>
+            </w:r>
+          </w:p>
+        </w:tc>
+        <w:tc>
+          <w:p>
+            <w:pPr>
+              <w:pStyle w:val="BodyText"/>
+            </w:pPr>
+            <w:pPr>
+              <w:spacing w:before="16" w:after="64"/>
+            </w:pPr>
+          </w:p>
+          <w:p>
+            <w:pPr>
+              <w:pStyle w:val="BodyText"/>
+            </w:pPr>
+            <w:pPr>
+              <w:spacing w:before="16"/>
+            </w:pPr>
+            <w:r>
+              <w:t xml:space="preserve">What is shown in this report</w:t>
+            </w:r>
+          </w:p>
+          <w:p>
+            <w:pPr>
+              <w:pStyle w:val="BodyText"/>
+            </w:pPr>
+            <w:pPr>
+              <w:spacing w:after="16"/>
+            </w:pPr>
+            <w:r>
+              <w:t xml:space="preserve">Generic start - good. Maybe refine a bit.</w:t>
+            </w:r>
+          </w:p>
+        </w:tc>
+      </w:tr>
+    </w:tbl>
     <w:p>
       <w:pPr>
         <w:pStyle w:val="BodyText"/>
       </w:pPr>
       <w:r>
-        <w:t xml:space="preserve">hhhhhhh</w:t>
-      </w:r>
-      <w:r>
-        <w:t xml:space="preserve"> </w:t>
-      </w:r>
-      <w:r>
-        <w:t xml:space="preserve">bhhhh</w:t>
-      </w:r>
-      <w:r>
-        <w:t xml:space="preserve"> </w:t>
-      </w:r>
-      <w:r>
-        <w:t xml:space="preserve">nnnnnn</w:t>
-      </w:r>
-    </w:p>
-    <w:bookmarkEnd w:id="169"/>
-    <w:bookmarkStart w:id="170" w:name="next-chapter"/>
-    <w:p>
-      <w:pPr>
-        <w:pStyle w:val="Heading1"/>
-      </w:pPr>
-      <w:r>
-        <w:t xml:space="preserve">6. Next chapter</w:t>
-      </w:r>
-    </w:p>
-    <w:p>
-      <w:pPr>
-        <w:pStyle w:val="FirstParagraph"/>
-      </w:pPr>
-      <w:r>
-        <w:t xml:space="preserve">This placeholder chapter is used to practice the git workflow.</w:t>
-      </w:r>
-    </w:p>
-    <w:p>
-      <w:pPr>
-        <w:pStyle w:val="BodyText"/>
-      </w:pPr>
-      <w:r>
-        <w:t xml:space="preserve">As a reminder: we can always toggle between the</w:t>
-      </w:r>
-      <w:r>
-        <w:t xml:space="preserve"> </w:t>
-      </w:r>
+        <w:t xml:space="preserve">This forth edition of the Brazil-Europe operational ANS performance comparison report builds on the joint project between the Performance Section of DECEA and the Performance Review Unit of EUROCONTROL.</w:t>
+      </w:r>
+      <w:r>
+        <w:t xml:space="preserve"> </w:t>
+      </w:r>
+      <w:r>
+        <w:t xml:space="preserve">The collaboration aims at fostering the understanding and support the further development of approaches to measure operational performance in both regions.</w:t>
+      </w:r>
+      <w:r>
+        <w:t xml:space="preserve"> </w:t>
+      </w:r>
+      <w:r>
+        <w:t xml:space="preserve">This report builds on a subset of indicators and metrics established under the umbrella of ICAO’s Global Air Navigation Plan</w:t>
+      </w:r>
+      <w:r>
+        <w:t xml:space="preserve"> </w:t>
+      </w:r>
+      <w:r>
+        <w:t xml:space="preserve">ICAO (2019)</w:t>
+      </w:r>
+      <w:r>
+        <w:t xml:space="preserve">.</w:t>
+      </w:r>
+      <w:r>
+        <w:t xml:space="preserve"> </w:t>
+      </w:r>
+      <w:r>
+        <w:t xml:space="preserve">The work is also used to showcase the application of the GANP indicators within a bi-regional and multi-regional project.</w:t>
+      </w:r>
+      <w:r>
+        <w:t xml:space="preserve"> </w:t>
+      </w:r>
+      <w:r>
+        <w:t xml:space="preserve">DECEA and EUROCONTROL engage actively within the international community and share their findings of their joint bi-regional work.</w:t>
+      </w:r>
+    </w:p>
+    <w:p>
+      <w:pPr>
+        <w:pStyle w:val="SourceCode"/>
+      </w:pPr>
       <w:r>
         <w:rPr>
           <w:rStyle w:val="VerbatimChar"/>
         </w:rPr>
-        <w:t xml:space="preserve">docs</w:t>
-      </w:r>
-      <w:r>
-        <w:t xml:space="preserve"> </w:t>
-      </w:r>
-      <w:r>
-        <w:t xml:space="preserve">folder that is used to serve the site and the</w:t>
-      </w:r>
-      <w:r>
-        <w:t xml:space="preserve"> </w:t>
-      </w:r>
-      <w:r>
-        <w:rPr>
-          <w:bCs/>
-          <w:b/>
-        </w:rPr>
-        <w:t xml:space="preserve">internal</w:t>
-      </w:r>
-      <w:r>
-        <w:t xml:space="preserve"> </w:t>
-      </w:r>
-      <w:r>
-        <w:t xml:space="preserve">(local testing) by switching the output-dir in</w:t>
-      </w:r>
-      <w:r>
-        <w:t xml:space="preserve"> </w:t>
+        <w:t xml:space="preserve">This iteration also comprised the integration of additional data sources on the Brazilian side.</w:t>
+      </w:r>
+      <w:r>
+        <w:br/>
       </w:r>
       <w:r>
         <w:rPr>
           <w:rStyle w:val="VerbatimChar"/>
         </w:rPr>
-        <w:t xml:space="preserve">_quarto.yml</w:t>
-      </w:r>
-      <w:r>
-        <w:t xml:space="preserve"> </w:t>
-      </w:r>
-      <w:r>
-        <w:t xml:space="preserve">to</w:t>
-      </w:r>
-      <w:r>
-        <w:t xml:space="preserve"> </w:t>
+        <w:t xml:space="preserve">The new data sources offer to perform more fine-grained analyses of the observed operational efficiency performance.</w:t>
+      </w:r>
+      <w:r>
+        <w:br/>
       </w:r>
       <w:r>
         <w:rPr>
           <w:rStyle w:val="VerbatimChar"/>
         </w:rPr>
-        <w:t xml:space="preserve">_books</w:t>
-      </w:r>
-      <w:r>
-        <w:t xml:space="preserve">.</w:t>
-      </w:r>
-    </w:p>
+        <w:t xml:space="preserve">This will allow to further develop and complement the framework.</w:t>
+      </w:r>
+      <w:r>
+        <w:br/>
+      </w:r>
+      <w:r>
+        <w:rPr>
+          <w:rStyle w:val="VerbatimChar"/>
+        </w:rPr>
+        <w:t xml:space="preserve">The report also identified several observations and ideas for future research which pave the way ahead for augmenting the associated set of comparison analyses.</w:t>
+      </w:r>
+    </w:p>
+    <w:tbl>
+      <w:tblPr>
+        <w:tblStyle w:val="Table"/>
+        <w:tblLook w:firstRow="0" w:lastRow="0" w:firstColumn="0" w:lastColumn="0" w:noHBand="0" w:noVBand="0" w:val="0000"/>
+        <w:tblBorders>
+          <w:left w:val="single" w:sz="24" w:space="0" w:color="0758E5"/>
+        </w:tblBorders>
+        <w:tblCellMar>
+          <w:left w:w="0" w:type="dxa"/>
+          <w:right w:w="0" w:type="dxa"/>
+        </w:tblCellMar>
+        <w:tblInd w:w="164" w:type="dxa"/>
+      </w:tblPr>
+      <w:tr>
+        <w:trPr>
+          <w:cantSplit/>
+        </w:trPr>
+        <w:tc>
+          <w:tcPr>
+            <w:tcMar>
+              <w:left w:w="144" w:type="dxa"/>
+              <w:right w:w="144" w:type="dxa"/>
+            </w:tcMar>
+          </w:tcPr>
+          <w:p>
+            <w:pPr>
+              <w:pStyle w:val="FirstParagraph"/>
+            </w:pPr>
+            <w:pPr>
+              <w:spacing w:before="0" w:after="8"/>
+              <w:jc w:val="center"/>
+            </w:pPr>
+            <w:r>
+              <w:drawing>
+                <wp:inline>
+                  <wp:extent cx="152400" cy="152400"/>
+                  <wp:effectExtent b="0" l="0" r="0" t="0"/>
+                  <wp:docPr descr="" title="" id="180" name="Picture"/>
+                  <a:graphic>
+                    <a:graphicData uri="http://schemas.openxmlformats.org/drawingml/2006/picture">
+                      <pic:pic>
+                        <pic:nvPicPr>
+                          <pic:cNvPr descr="/Applications/quarto/share/formats/docx/note.png" id="181" name="Picture"/>
+                          <pic:cNvPicPr>
+                            <a:picLocks noChangeArrowheads="1" noChangeAspect="1"/>
+                          </pic:cNvPicPr>
+                        </pic:nvPicPr>
+                        <pic:blipFill>
+                          <a:blip r:embed="rId63"/>
+                          <a:stretch>
+                            <a:fillRect/>
+                          </a:stretch>
+                        </pic:blipFill>
+                        <pic:spPr bwMode="auto">
+                          <a:xfrm>
+                            <a:off x="0" y="0"/>
+                            <a:ext cx="152400" cy="152400"/>
+                          </a:xfrm>
+                          <a:prstGeom prst="rect">
+                            <a:avLst/>
+                          </a:prstGeom>
+                          <a:noFill/>
+                          <a:ln w="9525">
+                            <a:noFill/>
+                            <a:headEnd/>
+                            <a:tailEnd/>
+                          </a:ln>
+                        </pic:spPr>
+                      </pic:pic>
+                    </a:graphicData>
+                  </a:graphic>
+                </wp:inline>
+              </w:drawing>
+            </w:r>
+          </w:p>
+        </w:tc>
+        <w:tc>
+          <w:p>
+            <w:pPr>
+              <w:pStyle w:val="BodyText"/>
+            </w:pPr>
+            <w:pPr>
+              <w:spacing w:before="16" w:after="64"/>
+            </w:pPr>
+          </w:p>
+          <w:p>
+            <w:pPr>
+              <w:pStyle w:val="BodyText"/>
+            </w:pPr>
+            <w:pPr>
+              <w:spacing w:before="16" w:after="16"/>
+            </w:pPr>
+            <w:r>
+              <w:t xml:space="preserve">Major findings</w:t>
+            </w:r>
+          </w:p>
+        </w:tc>
+      </w:tr>
+    </w:tbl>
     <w:p>
       <w:pPr>
         <w:pStyle w:val="BodyText"/>
       </w:pPr>
       <w:r>
-        <w:t xml:space="preserve">We can mock around with it without impacting the exising material.</w:t>
-      </w:r>
-    </w:p>
+        <w:t xml:space="preserve"> </w:t>
+      </w:r>
+    </w:p>
+    <w:p>
+      <w:pPr>
+        <w:pStyle w:val="SourceCode"/>
+      </w:pPr>
+      <w:r>
+        <w:rPr>
+          <w:rStyle w:val="VerbatimChar"/>
+        </w:rPr>
+        <w:t xml:space="preserve">This report kicked off by examining the commonalities and differences in terms of the organisation of air navigation services in both regions.</w:t>
+      </w:r>
+      <w:r>
+        <w:br/>
+      </w:r>
+      <w:r>
+        <w:rPr>
+          <w:rStyle w:val="VerbatimChar"/>
+        </w:rPr>
+        <w:t xml:space="preserve">This was complemented by investigating the air traffic demand to better understand the factors influencing operational performance.</w:t>
+      </w:r>
+      <w:r>
+        <w:br/>
+      </w:r>
+      <w:r>
+        <w:rPr>
+          <w:rStyle w:val="VerbatimChar"/>
+        </w:rPr>
+        <w:t xml:space="preserve">The air navigation service provision is less fragmented in Brazil than in Europe.</w:t>
+      </w:r>
+      <w:r>
+        <w:br/>
+      </w:r>
+      <w:r>
+        <w:rPr>
+          <w:rStyle w:val="VerbatimChar"/>
+        </w:rPr>
+        <w:t xml:space="preserve">This plays out in the total number of air traffic service units.</w:t>
+      </w:r>
+      <w:r>
+        <w:br/>
+      </w:r>
+      <w:r>
+        <w:rPr>
+          <w:rStyle w:val="VerbatimChar"/>
+        </w:rPr>
+        <w:t xml:space="preserve">Both regions operate a central flow management function to ensure network wide flow management.</w:t>
+      </w:r>
+      <w:r>
+        <w:br/>
+      </w:r>
+      <w:r>
+        <w:br/>
+      </w:r>
+      <w:r>
+        <w:rPr>
+          <w:rStyle w:val="VerbatimChar"/>
+        </w:rPr>
+        <w:t xml:space="preserve">In terms of air traffic demand, both regions were impacted by the unprecedented decline of air traffic.</w:t>
+      </w:r>
+      <w:r>
+        <w:br/>
+      </w:r>
+      <w:r>
+        <w:rPr>
+          <w:rStyle w:val="VerbatimChar"/>
+        </w:rPr>
+        <w:t xml:space="preserve">Regional and global traffic restrictions resulted in different patterns.</w:t>
+      </w:r>
+      <w:r>
+        <w:br/>
+      </w:r>
+      <w:r>
+        <w:rPr>
+          <w:rStyle w:val="VerbatimChar"/>
+        </w:rPr>
+        <w:t xml:space="preserve">The recovery in Brazil followed a more continual path, while Europe experienced setbacks due to the variety of national and pan-European measures deployed to curb the spread of COVID.</w:t>
+      </w:r>
+      <w:r>
+        <w:br/>
+      </w:r>
+      <w:r>
+        <w:rPr>
+          <w:rStyle w:val="VerbatimChar"/>
+        </w:rPr>
+        <w:t xml:space="preserve">In 2022, the Brazilian system serviced more traffic than pre-pandemic.</w:t>
+      </w:r>
+      <w:r>
+        <w:br/>
+      </w:r>
+      <w:r>
+        <w:rPr>
+          <w:rStyle w:val="VerbatimChar"/>
+        </w:rPr>
+        <w:t xml:space="preserve">In terms of traffic volume, Europe is still lagging behind with about 85-90% of pre-pandemic network level traffic in 2022.</w:t>
+      </w:r>
+      <w:r>
+        <w:br/>
+      </w:r>
+      <w:r>
+        <w:rPr>
+          <w:rStyle w:val="VerbatimChar"/>
+        </w:rPr>
+        <w:t xml:space="preserve">The traffic situation is also reflected by the demand at the study airports.</w:t>
+      </w:r>
+      <w:r>
+        <w:br/>
+      </w:r>
+      <w:r>
+        <w:rPr>
+          <w:rStyle w:val="VerbatimChar"/>
+        </w:rPr>
+        <w:t xml:space="preserve">There is also a higher level of diversity in terms of air traffic evidenced by the share of light types serviced at the comparison airports.</w:t>
+      </w:r>
+      <w:r>
+        <w:br/>
+      </w:r>
+      <w:r>
+        <w:rPr>
+          <w:rStyle w:val="VerbatimChar"/>
+        </w:rPr>
+        <w:t xml:space="preserve">International traffic is more centralised in Brazil than in Europe.</w:t>
+      </w:r>
+      <w:r>
+        <w:br/>
+      </w:r>
+      <w:r>
+        <w:br/>
+      </w:r>
+      <w:r>
+        <w:rPr>
+          <w:rStyle w:val="VerbatimChar"/>
+        </w:rPr>
+        <w:t xml:space="preserve">The observed punctuality in both regions was strongly influenced by the prevailing COVID-19 recovery.</w:t>
+      </w:r>
+      <w:r>
+        <w:br/>
+      </w:r>
+      <w:r>
+        <w:rPr>
+          <w:rStyle w:val="VerbatimChar"/>
+        </w:rPr>
+        <w:t xml:space="preserve">Particularly, Europe suffered strongly from the surge of air traffic demand in early 2022 which is evidenced by the high share of departure delays.</w:t>
+      </w:r>
+      <w:r>
+        <w:br/>
+      </w:r>
+      <w:r>
+        <w:rPr>
+          <w:rStyle w:val="VerbatimChar"/>
+        </w:rPr>
+        <w:t xml:space="preserve">The reactionary knock-on effect amplified further the overall punctuality performance.</w:t>
+      </w:r>
+      <w:r>
+        <w:br/>
+      </w:r>
+      <w:r>
+        <w:br/>
+      </w:r>
+      <w:r>
+        <w:rPr>
+          <w:rStyle w:val="VerbatimChar"/>
+        </w:rPr>
+        <w:t xml:space="preserve">The utilisation of available runway system capacities is a fundamental enabler for high levels of operational performance.</w:t>
+      </w:r>
+      <w:r>
+        <w:br/>
+      </w:r>
+      <w:r>
+        <w:rPr>
+          <w:rStyle w:val="VerbatimChar"/>
+        </w:rPr>
+        <w:t xml:space="preserve">This report showed that associated capacities are commensurate with the current traffic levels.</w:t>
+      </w:r>
+      <w:r>
+        <w:br/>
+      </w:r>
+      <w:r>
+        <w:rPr>
+          <w:rStyle w:val="VerbatimChar"/>
+        </w:rPr>
+        <w:t xml:space="preserve">For the majority of airports, the realised throughput ranges still below the maximum declared capacities.</w:t>
+      </w:r>
+      <w:r>
+        <w:br/>
+      </w:r>
+      <w:r>
+        <w:br/>
+      </w:r>
+      <w:r>
+        <w:rPr>
+          <w:rStyle w:val="VerbatimChar"/>
+        </w:rPr>
+        <w:t xml:space="preserve">Operational efficiency is measured in this report in the form of the additional time during the surface movement phases and the terminal arrival phase.</w:t>
+      </w:r>
+      <w:r>
+        <w:br/>
+      </w:r>
+      <w:r>
+        <w:rPr>
+          <w:rStyle w:val="VerbatimChar"/>
+        </w:rPr>
+        <w:t xml:space="preserve">On average, taxi-in operations are less constrained than taxi-out operations.</w:t>
+      </w:r>
+      <w:r>
+        <w:br/>
+      </w:r>
+      <w:r>
+        <w:rPr>
+          <w:rStyle w:val="VerbatimChar"/>
+        </w:rPr>
+        <w:t xml:space="preserve">The observed performance varies across the airports and timeframe.</w:t>
+      </w:r>
+      <w:r>
+        <w:br/>
+      </w:r>
+      <w:r>
+        <w:rPr>
+          <w:rStyle w:val="VerbatimChar"/>
+        </w:rPr>
+        <w:t xml:space="preserve">In terms of arrival management, air traffic in Brazil observed higher additional times in the terminal airspace.</w:t>
+      </w:r>
+      <w:r>
+        <w:br/>
+      </w:r>
+      <w:r>
+        <w:rPr>
+          <w:rStyle w:val="VerbatimChar"/>
+        </w:rPr>
+        <w:t xml:space="preserve">This report showed that the scale effect of lower air traffic are potentially masked by the effects of airspace redesign in Brazil.</w:t>
+      </w:r>
+      <w:r>
+        <w:br/>
+      </w:r>
+      <w:r>
+        <w:rPr>
+          <w:rStyle w:val="VerbatimChar"/>
+        </w:rPr>
+        <w:t xml:space="preserve">In the European region, it appears that the higher level of air traffic demand puts pressure on the arrival management and sequencing, and 2022 marks a return to higher additional times within the terminal airspace.</w:t>
+      </w:r>
+      <w:r>
+        <w:br/>
+      </w:r>
+      <w:r>
+        <w:rPr>
+          <w:rStyle w:val="VerbatimChar"/>
+        </w:rPr>
+        <w:t xml:space="preserve">Further research can help to identify drivers and performance enablers.</w:t>
+      </w:r>
+    </w:p>
+    <w:tbl>
+      <w:tblPr>
+        <w:tblStyle w:val="Table"/>
+        <w:tblLook w:firstRow="0" w:lastRow="0" w:firstColumn="0" w:lastColumn="0" w:noHBand="0" w:noVBand="0" w:val="0000"/>
+        <w:tblBorders>
+          <w:left w:val="single" w:sz="24" w:space="0" w:color="0758E5"/>
+        </w:tblBorders>
+        <w:tblCellMar>
+          <w:left w:w="0" w:type="dxa"/>
+          <w:right w:w="0" w:type="dxa"/>
+        </w:tblCellMar>
+        <w:tblInd w:w="164" w:type="dxa"/>
+      </w:tblPr>
+      <w:tr>
+        <w:trPr>
+          <w:cantSplit/>
+        </w:trPr>
+        <w:tc>
+          <w:tcPr>
+            <w:tcMar>
+              <w:left w:w="144" w:type="dxa"/>
+              <w:right w:w="144" w:type="dxa"/>
+            </w:tcMar>
+          </w:tcPr>
+          <w:p>
+            <w:pPr>
+              <w:pStyle w:val="FirstParagraph"/>
+            </w:pPr>
+            <w:pPr>
+              <w:spacing w:before="0" w:after="8"/>
+              <w:jc w:val="center"/>
+            </w:pPr>
+            <w:r>
+              <w:drawing>
+                <wp:inline>
+                  <wp:extent cx="152400" cy="152400"/>
+                  <wp:effectExtent b="0" l="0" r="0" t="0"/>
+                  <wp:docPr descr="" title="" id="182" name="Picture"/>
+                  <a:graphic>
+                    <a:graphicData uri="http://schemas.openxmlformats.org/drawingml/2006/picture">
+                      <pic:pic>
+                        <pic:nvPicPr>
+                          <pic:cNvPr descr="/Applications/quarto/share/formats/docx/note.png" id="183" name="Picture"/>
+                          <pic:cNvPicPr>
+                            <a:picLocks noChangeArrowheads="1" noChangeAspect="1"/>
+                          </pic:cNvPicPr>
+                        </pic:nvPicPr>
+                        <pic:blipFill>
+                          <a:blip r:embed="rId63"/>
+                          <a:stretch>
+                            <a:fillRect/>
+                          </a:stretch>
+                        </pic:blipFill>
+                        <pic:spPr bwMode="auto">
+                          <a:xfrm>
+                            <a:off x="0" y="0"/>
+                            <a:ext cx="152400" cy="152400"/>
+                          </a:xfrm>
+                          <a:prstGeom prst="rect">
+                            <a:avLst/>
+                          </a:prstGeom>
+                          <a:noFill/>
+                          <a:ln w="9525">
+                            <a:noFill/>
+                            <a:headEnd/>
+                            <a:tailEnd/>
+                          </a:ln>
+                        </pic:spPr>
+                      </pic:pic>
+                    </a:graphicData>
+                  </a:graphic>
+                </wp:inline>
+              </w:drawing>
+            </w:r>
+          </w:p>
+        </w:tc>
+        <w:tc>
+          <w:p>
+            <w:pPr>
+              <w:pStyle w:val="BodyText"/>
+            </w:pPr>
+            <w:pPr>
+              <w:spacing w:before="16" w:after="64"/>
+            </w:pPr>
+          </w:p>
+          <w:p>
+            <w:pPr>
+              <w:pStyle w:val="BodyText"/>
+            </w:pPr>
+            <w:pPr>
+              <w:spacing w:before="16" w:after="16"/>
+            </w:pPr>
+            <w:r>
+              <w:t xml:space="preserve">Outlook</w:t>
+            </w:r>
+          </w:p>
+        </w:tc>
+      </w:tr>
+    </w:tbl>
     <w:p>
       <w:pPr>
         <w:pStyle w:val="BodyText"/>
       </w:pPr>
       <w:r>
-        <w:t xml:space="preserve">The workflow will be to update chapter by chapter - and use this for experimental purposes. In the end we simply delete / remove this file.</w:t>
+        <w:t xml:space="preserve">This fourth edition of the bi-regional comparison report documents the continued technical collaboration between DECEA and EUROCONTROL.</w:t>
+      </w:r>
+    </w:p>
+    <w:p>
+      <w:pPr>
+        <w:pStyle w:val="SourceCode"/>
+      </w:pPr>
+      <w:r>
+        <w:rPr>
+          <w:rStyle w:val="VerbatimChar"/>
+        </w:rPr>
+        <w:t xml:space="preserve">The joint work also helped to promote the approach and state-of-the-art with the international community.</w:t>
+      </w:r>
+      <w:r>
+        <w:br/>
+      </w:r>
+      <w:r>
+        <w:rPr>
+          <w:rStyle w:val="VerbatimChar"/>
+        </w:rPr>
+        <w:t xml:space="preserve">Both groups are contributing to the ICAO GANP Performance Expert Group and the multi-national Performance Benchmarking Working Group.</w:t>
+      </w:r>
+      <w:r>
+        <w:br/>
+      </w:r>
+      <w:r>
+        <w:rPr>
+          <w:rStyle w:val="VerbatimChar"/>
+        </w:rPr>
+        <w:t xml:space="preserve">The wider harmonisation of performance related data and joint refinement of the guidance material and application of the performance framework start paying dividends.</w:t>
+      </w:r>
+      <w:r>
+        <w:br/>
+      </w:r>
+      <w:r>
+        <w:rPr>
+          <w:rStyle w:val="VerbatimChar"/>
+        </w:rPr>
+        <w:t xml:space="preserve">For example, PBWG concluded in its most recent meeting to collaborate on topics of mutual interest for which this report supported the initial research and validation.</w:t>
+      </w:r>
+      <w:r>
+        <w:br/>
+      </w:r>
+      <w:r>
+        <w:br/>
+      </w:r>
+      <w:r>
+        <w:rPr>
+          <w:rStyle w:val="VerbatimChar"/>
+        </w:rPr>
+        <w:t xml:space="preserve">A further outcome of the project is the close technical collaboration.</w:t>
+      </w:r>
+      <w:r>
+        <w:br/>
+      </w:r>
+      <w:r>
+        <w:rPr>
+          <w:rStyle w:val="VerbatimChar"/>
+        </w:rPr>
+        <w:t xml:space="preserve">It is planned to augment the report and its future editions with a rolling web-based monitoring, including regular updates of the underlying data.</w:t>
+      </w:r>
+      <w:r>
+        <w:br/>
+      </w:r>
+      <w:r>
+        <w:rPr>
+          <w:rStyle w:val="VerbatimChar"/>
+        </w:rPr>
+        <w:t xml:space="preserve">This and future reports will help to complement the time series of the measures tracked.</w:t>
+      </w:r>
+    </w:p>
+    <w:bookmarkEnd w:id="184"/>
+    <w:bookmarkStart w:id="191" w:name="studies"/>
+    <w:p>
+      <w:pPr>
+        <w:pStyle w:val="Heading1"/>
+      </w:pPr>
+      <w:r>
+        <w:t xml:space="preserve">6. Studies</w:t>
+      </w:r>
+    </w:p>
+    <w:p>
+      <w:pPr>
+        <w:pStyle w:val="FirstParagraph"/>
+      </w:pPr>
+      <w:r>
+        <w:t xml:space="preserve">this is the placeholder for PM</w:t>
       </w:r>
     </w:p>
     <w:p>
@@ -6805,19 +7653,149 @@
         <w:pStyle w:val="BodyText"/>
       </w:pPr>
       <w:r>
-        <w:t xml:space="preserve">Just some new text and cool add ons.</w:t>
+        <w:drawing>
+          <wp:inline>
+            <wp:extent cx="5334000" cy="2797173"/>
+            <wp:effectExtent b="0" l="0" r="0" t="0"/>
+            <wp:docPr descr="" title="" id="186" name="Picture"/>
+            <a:graphic>
+              <a:graphicData uri="http://schemas.openxmlformats.org/drawingml/2006/picture">
+                <pic:pic>
+                  <pic:nvPicPr>
+                    <pic:cNvPr descr="figures/HLC-table.png" id="187" name="Picture"/>
+                    <pic:cNvPicPr>
+                      <a:picLocks noChangeArrowheads="1" noChangeAspect="1"/>
+                    </pic:cNvPicPr>
+                  </pic:nvPicPr>
+                  <pic:blipFill>
+                    <a:blip r:embed="rId185"/>
+                    <a:stretch>
+                      <a:fillRect/>
+                    </a:stretch>
+                  </pic:blipFill>
+                  <pic:spPr bwMode="auto">
+                    <a:xfrm>
+                      <a:off x="0" y="0"/>
+                      <a:ext cx="5334000" cy="2797173"/>
+                    </a:xfrm>
+                    <a:prstGeom prst="rect">
+                      <a:avLst/>
+                    </a:prstGeom>
+                    <a:noFill/>
+                    <a:ln w="9525">
+                      <a:noFill/>
+                      <a:headEnd/>
+                      <a:tailEnd/>
+                    </a:ln>
+                  </pic:spPr>
+                </pic:pic>
+              </a:graphicData>
+            </a:graphic>
+          </wp:inline>
+        </w:drawing>
       </w:r>
     </w:p>
     <w:p>
       <w:pPr>
         <w:pStyle w:val="BodyText"/>
       </w:pPr>
-      <w:r>
-        <w:t xml:space="preserve">next edit</w:t>
-      </w:r>
-    </w:p>
-    <w:bookmarkEnd w:id="170"/>
-    <w:bookmarkStart w:id="176" w:name="references"/>
+      <w:hyperlink w:anchor="fig-hlc-table-demo">
+        <w:r>
+          <w:rPr>
+            <w:rStyle w:val="Hyperlink"/>
+          </w:rPr>
+          <w:t xml:space="preserve">Figure 6.1</w:t>
+        </w:r>
+      </w:hyperlink>
+      <w:r>
+        <w:t xml:space="preserve"> </w:t>
+      </w:r>
+      <w:r>
+        <w:t xml:space="preserve">is a great example of how the 2 regions compare.</w:t>
+      </w:r>
+    </w:p>
+    <w:tbl>
+      <w:tblPr>
+        <w:tblStyle w:val="Table"/>
+        <w:tblW w:type="pct" w:w="5000"/>
+        <w:tblLook w:firstRow="0" w:lastRow="0" w:firstColumn="0" w:lastColumn="0" w:noHBand="0" w:noVBand="0" w:val="0000"/>
+        <w:jc w:val="start"/>
+        <w:tblLayout w:type="fixed"/>
+      </w:tblPr>
+      <w:tblGrid>
+        <w:gridCol w:w="7920"/>
+      </w:tblGrid>
+      <w:tr>
+        <w:tc>
+          <w:tcPr/>
+          <w:bookmarkStart w:id="190" w:name="fig-hlc-table-demo"/>
+          <w:p>
+            <w:pPr>
+              <w:pStyle w:val="Compact"/>
+              <w:jc w:val="center"/>
+            </w:pPr>
+            <w:r>
+              <w:drawing>
+                <wp:inline>
+                  <wp:extent cx="2667000" cy="1398586"/>
+                  <wp:effectExtent b="0" l="0" r="0" t="0"/>
+                  <wp:docPr descr="" title="" id="188" name="Picture"/>
+                  <a:graphic>
+                    <a:graphicData uri="http://schemas.openxmlformats.org/drawingml/2006/picture">
+                      <pic:pic>
+                        <pic:nvPicPr>
+                          <pic:cNvPr descr="figures/HLC-table.png" id="189" name="Picture"/>
+                          <pic:cNvPicPr>
+                            <a:picLocks noChangeArrowheads="1" noChangeAspect="1"/>
+                          </pic:cNvPicPr>
+                        </pic:nvPicPr>
+                        <pic:blipFill>
+                          <a:blip r:embed="rId185"/>
+                          <a:stretch>
+                            <a:fillRect/>
+                          </a:stretch>
+                        </pic:blipFill>
+                        <pic:spPr bwMode="auto">
+                          <a:xfrm>
+                            <a:off x="0" y="0"/>
+                            <a:ext cx="2667000" cy="1398586"/>
+                          </a:xfrm>
+                          <a:prstGeom prst="rect">
+                            <a:avLst/>
+                          </a:prstGeom>
+                          <a:noFill/>
+                          <a:ln w="9525">
+                            <a:noFill/>
+                            <a:headEnd/>
+                            <a:tailEnd/>
+                          </a:ln>
+                        </pic:spPr>
+                      </pic:pic>
+                    </a:graphicData>
+                  </a:graphic>
+                </wp:inline>
+              </w:drawing>
+            </w:r>
+          </w:p>
+          <w:p>
+            <w:pPr>
+              <w:jc w:val="center"/>
+            </w:pPr>
+            <w:pPr>
+              <w:jc w:val="start"/>
+              <w:spacing w:before="200"/>
+              <w:pStyle w:val="ImageCaption"/>
+            </w:pPr>
+            <w:r>
+              <w:t xml:space="preserve">Figure 6.1: This is our hlc table</w:t>
+            </w:r>
+          </w:p>
+          <w:bookmarkEnd w:id="190"/>
+        </w:tc>
+      </w:tr>
+    </w:tbl>
+    <w:bookmarkEnd w:id="191"/>
+    <w:bookmarkStart w:id="198" w:name="references"/>
     <w:p>
       <w:pPr>
         <w:pStyle w:val="Heading1"/>
@@ -6826,8 +7804,8 @@
         <w:t xml:space="preserve">References</w:t>
       </w:r>
     </w:p>
-    <w:bookmarkStart w:id="175" w:name="refs"/>
-    <w:bookmarkStart w:id="172" w:name="ref-apdf_v1_2019"/>
+    <w:bookmarkStart w:id="197" w:name="refs"/>
+    <w:bookmarkStart w:id="193" w:name="ref-apdf_v1_2019"/>
     <w:p>
       <w:pPr>
         <w:pStyle w:val="Bibliography"/>
@@ -6877,7 +7855,7 @@
       <w:r>
         <w:t xml:space="preserve"> </w:t>
       </w:r>
-      <w:hyperlink r:id="rId171">
+      <w:hyperlink r:id="rId192">
         <w:r>
           <w:rPr>
             <w:rStyle w:val="Hyperlink"/>
@@ -6889,8 +7867,8 @@
         <w:t xml:space="preserve">.</w:t>
       </w:r>
     </w:p>
-    <w:bookmarkEnd w:id="172"/>
-    <w:bookmarkStart w:id="174" w:name="ref-CODA-2023"/>
+    <w:bookmarkEnd w:id="193"/>
+    <w:bookmarkStart w:id="195" w:name="ref-CODA-2023"/>
     <w:p>
       <w:pPr>
         <w:pStyle w:val="Bibliography"/>
@@ -6907,7 +7885,7 @@
       <w:r>
         <w:t xml:space="preserve"> </w:t>
       </w:r>
-      <w:hyperlink r:id="rId173">
+      <w:hyperlink r:id="rId194">
         <w:r>
           <w:rPr>
             <w:rStyle w:val="Hyperlink"/>
@@ -6919,9 +7897,127 @@
         <w:t xml:space="preserve">.</w:t>
       </w:r>
     </w:p>
-    <w:bookmarkEnd w:id="174"/>
-    <w:bookmarkEnd w:id="175"/>
-    <w:bookmarkEnd w:id="176"/>
+    <w:bookmarkEnd w:id="195"/>
+    <w:bookmarkStart w:id="196" w:name="ref-icao_doc9750_2019"/>
+    <w:p>
+      <w:pPr>
+        <w:pStyle w:val="Bibliography"/>
+      </w:pPr>
+      <w:r>
+        <w:t xml:space="preserve">ICAO. 2019.</w:t>
+      </w:r>
+      <w:r>
+        <w:t xml:space="preserve"> </w:t>
+      </w:r>
+      <w:r>
+        <w:rPr>
+          <w:iCs/>
+          <w:i/>
+        </w:rPr>
+        <w:t xml:space="preserve">Doc 9750,</w:t>
+      </w:r>
+      <w:r>
+        <w:rPr>
+          <w:iCs/>
+          <w:i/>
+        </w:rPr>
+        <w:t xml:space="preserve"> </w:t>
+      </w:r>
+      <w:r>
+        <w:rPr>
+          <w:iCs/>
+          <w:i/>
+        </w:rPr>
+        <w:t xml:space="preserve">Capacity</w:t>
+      </w:r>
+      <w:r>
+        <w:rPr>
+          <w:iCs/>
+          <w:i/>
+        </w:rPr>
+        <w:t xml:space="preserve"> </w:t>
+      </w:r>
+      <w:r>
+        <w:rPr>
+          <w:iCs/>
+          <w:i/>
+        </w:rPr>
+        <w:t xml:space="preserve">&amp;</w:t>
+      </w:r>
+      <w:r>
+        <w:rPr>
+          <w:iCs/>
+          <w:i/>
+        </w:rPr>
+        <w:t xml:space="preserve"> </w:t>
+      </w:r>
+      <w:r>
+        <w:rPr>
+          <w:iCs/>
+          <w:i/>
+        </w:rPr>
+        <w:t xml:space="preserve">Efficiency</w:t>
+      </w:r>
+      <w:r>
+        <w:rPr>
+          <w:iCs/>
+          <w:i/>
+        </w:rPr>
+        <w:t xml:space="preserve">,</w:t>
+      </w:r>
+      <w:r>
+        <w:rPr>
+          <w:iCs/>
+          <w:i/>
+        </w:rPr>
+        <w:t xml:space="preserve"> </w:t>
+      </w:r>
+      <w:r>
+        <w:rPr>
+          <w:iCs/>
+          <w:i/>
+        </w:rPr>
+        <w:t xml:space="preserve">Global Air Navigation Plan</w:t>
+      </w:r>
+      <w:r>
+        <w:rPr>
+          <w:iCs/>
+          <w:i/>
+        </w:rPr>
+        <w:t xml:space="preserve"> </w:t>
+      </w:r>
+      <w:r>
+        <w:rPr>
+          <w:iCs/>
+          <w:i/>
+        </w:rPr>
+        <w:t xml:space="preserve">2016-2030</w:t>
+      </w:r>
+      <w:r>
+        <w:t xml:space="preserve">. Sixth Edition.</w:t>
+      </w:r>
+      <w:r>
+        <w:t xml:space="preserve"> </w:t>
+      </w:r>
+      <w:r>
+        <w:t xml:space="preserve">Montreal, Canada</w:t>
+      </w:r>
+      <w:r>
+        <w:t xml:space="preserve">:</w:t>
+      </w:r>
+      <w:r>
+        <w:t xml:space="preserve"> </w:t>
+      </w:r>
+      <w:r>
+        <w:t xml:space="preserve">International Civil Aviation Organization</w:t>
+      </w:r>
+      <w:r>
+        <w:t xml:space="preserve">.</w:t>
+      </w:r>
+    </w:p>
+    <w:bookmarkEnd w:id="196"/>
+    <w:bookmarkEnd w:id="197"/>
+    <w:bookmarkEnd w:id="198"/>
     <w:sectPr/>
   </w:body>
 </w:document>
@@ -6985,7 +8081,7 @@
       </w:r>
     </w:p>
   </w:footnote>
-  <w:footnote w:id="109">
+  <w:footnote w:id="118">
     <w:p>
       <w:pPr>
         <w:pStyle w:val="FootnoteText"/>
@@ -7034,7 +8130,7 @@
       </w:r>
     </w:p>
   </w:footnote>
-  <w:footnote w:id="144">
+  <w:footnote w:id="153">
     <w:p>
       <w:pPr>
         <w:pStyle w:val="FootnoteText"/>

</xml_diff>